<commit_message>
Creacion del Doc y Pdf
</commit_message>
<xml_diff>
--- a/Acceptance_Testing_G1_final.docx
+++ b/Acceptance_Testing_G1_final.docx
@@ -1400,15 +1400,7 @@
         <w:spacing w:before="200" w:after="120"/>
       </w:pPr>
       <w:r>
-        <w:t xml:space="preserve">2.2. </w:t>
-      </w:r>
-      <w:proofErr w:type="gramStart"/>
-      <w:r>
-        <w:t>Parte</w:t>
-      </w:r>
-      <w:proofErr w:type="gramEnd"/>
-      <w:r>
-        <w:t xml:space="preserve"> 2: Desarrollo de pruebas</w:t>
+        <w:t>2.2. Parte 2: Desarrollo de pruebas</w:t>
       </w:r>
     </w:p>
     <w:p>
@@ -1445,25 +1437,14 @@
           <w:lang w:val="es-EC"/>
         </w:rPr>
       </w:pPr>
-      <w:proofErr w:type="gramStart"/>
-      <w:r>
-        <w:rPr>
-          <w:rFonts w:ascii="Consolas" w:eastAsia="Consolas" w:hAnsi="Consolas" w:cs="Consolas"/>
-          <w:sz w:val="17"/>
-          <w:szCs w:val="17"/>
-          <w:lang w:val="es-EC"/>
-        </w:rPr>
-        <w:t>inventory-manager</w:t>
-      </w:r>
-      <w:proofErr w:type="gramEnd"/>
-      <w:r>
-        <w:rPr>
-          <w:rFonts w:ascii="Consolas" w:eastAsia="Consolas" w:hAnsi="Consolas" w:cs="Consolas"/>
-          <w:sz w:val="17"/>
-          <w:szCs w:val="17"/>
-          <w:lang w:val="es-EC"/>
-        </w:rPr>
-        <w:t>/</w:t>
+      <w:r>
+        <w:rPr>
+          <w:rFonts w:ascii="Consolas" w:eastAsia="Consolas" w:hAnsi="Consolas" w:cs="Consolas"/>
+          <w:sz w:val="17"/>
+          <w:szCs w:val="17"/>
+          <w:lang w:val="es-EC"/>
+        </w:rPr>
+        <w:t>inventory-manager/</w:t>
       </w:r>
     </w:p>
     <w:p>
@@ -1564,185 +1545,77 @@
           <w:sz w:val="17"/>
           <w:szCs w:val="17"/>
         </w:rPr>
-        <w:t xml:space="preserve">    environment.py            # Hooks de Behave (</w:t>
-      </w:r>
-      <w:proofErr w:type="gramStart"/>
-      <w:r>
-        <w:rPr>
-          <w:rFonts w:ascii="Consolas" w:eastAsia="Consolas" w:hAnsi="Consolas" w:cs="Consolas"/>
-          <w:sz w:val="17"/>
-          <w:szCs w:val="17"/>
-        </w:rPr>
-        <w:t>sys.path</w:t>
-      </w:r>
-      <w:proofErr w:type="gramEnd"/>
-      <w:r>
-        <w:rPr>
-          <w:rFonts w:ascii="Consolas" w:eastAsia="Consolas" w:hAnsi="Consolas" w:cs="Consolas"/>
-          <w:sz w:val="17"/>
-          <w:szCs w:val="17"/>
-        </w:rPr>
-        <w:t>)</w:t>
-      </w:r>
-    </w:p>
-    <w:p>
-      <w:pPr>
-        <w:shd w:val="clear" w:color="auto" w:fill="F2F2F2"/>
-        <w:ind w:left="240" w:right="240"/>
-      </w:pPr>
-      <w:r>
-        <w:rPr>
-          <w:rFonts w:ascii="Consolas" w:eastAsia="Consolas" w:hAnsi="Consolas" w:cs="Consolas"/>
-          <w:sz w:val="17"/>
-          <w:szCs w:val="17"/>
-        </w:rPr>
-        <w:t xml:space="preserve">    add_</w:t>
-      </w:r>
-      <w:proofErr w:type="gramStart"/>
-      <w:r>
-        <w:rPr>
-          <w:rFonts w:ascii="Consolas" w:eastAsia="Consolas" w:hAnsi="Consolas" w:cs="Consolas"/>
-          <w:sz w:val="17"/>
-          <w:szCs w:val="17"/>
-        </w:rPr>
-        <w:t>product.feature</w:t>
-      </w:r>
-      <w:proofErr w:type="gramEnd"/>
-      <w:r>
-        <w:rPr>
-          <w:rFonts w:ascii="Consolas" w:eastAsia="Consolas" w:hAnsi="Consolas" w:cs="Consolas"/>
-          <w:sz w:val="17"/>
-          <w:szCs w:val="17"/>
-        </w:rPr>
-        <w:t xml:space="preserve">       # Feature 1</w:t>
-      </w:r>
-    </w:p>
-    <w:p>
-      <w:pPr>
-        <w:shd w:val="clear" w:color="auto" w:fill="F2F2F2"/>
-        <w:ind w:left="240" w:right="240"/>
-      </w:pPr>
-      <w:r>
-        <w:rPr>
-          <w:rFonts w:ascii="Consolas" w:eastAsia="Consolas" w:hAnsi="Consolas" w:cs="Consolas"/>
-          <w:sz w:val="17"/>
-          <w:szCs w:val="17"/>
-        </w:rPr>
-        <w:t xml:space="preserve">    list_</w:t>
-      </w:r>
-      <w:proofErr w:type="gramStart"/>
-      <w:r>
-        <w:rPr>
-          <w:rFonts w:ascii="Consolas" w:eastAsia="Consolas" w:hAnsi="Consolas" w:cs="Consolas"/>
-          <w:sz w:val="17"/>
-          <w:szCs w:val="17"/>
-        </w:rPr>
-        <w:t>products.feature</w:t>
-      </w:r>
-      <w:proofErr w:type="gramEnd"/>
-      <w:r>
-        <w:rPr>
-          <w:rFonts w:ascii="Consolas" w:eastAsia="Consolas" w:hAnsi="Consolas" w:cs="Consolas"/>
-          <w:sz w:val="17"/>
-          <w:szCs w:val="17"/>
-        </w:rPr>
-        <w:t xml:space="preserve">     # Feature 2</w:t>
-      </w:r>
-    </w:p>
-    <w:p>
-      <w:pPr>
-        <w:shd w:val="clear" w:color="auto" w:fill="F2F2F2"/>
-        <w:ind w:left="240" w:right="240"/>
-      </w:pPr>
-      <w:r>
-        <w:rPr>
-          <w:rFonts w:ascii="Consolas" w:eastAsia="Consolas" w:hAnsi="Consolas" w:cs="Consolas"/>
-          <w:sz w:val="17"/>
-          <w:szCs w:val="17"/>
-        </w:rPr>
-        <w:t xml:space="preserve">    update_</w:t>
-      </w:r>
-      <w:proofErr w:type="gramStart"/>
-      <w:r>
-        <w:rPr>
-          <w:rFonts w:ascii="Consolas" w:eastAsia="Consolas" w:hAnsi="Consolas" w:cs="Consolas"/>
-          <w:sz w:val="17"/>
-          <w:szCs w:val="17"/>
-        </w:rPr>
-        <w:t>quantity.feature</w:t>
-      </w:r>
-      <w:proofErr w:type="gramEnd"/>
-      <w:r>
-        <w:rPr>
-          <w:rFonts w:ascii="Consolas" w:eastAsia="Consolas" w:hAnsi="Consolas" w:cs="Consolas"/>
-          <w:sz w:val="17"/>
-          <w:szCs w:val="17"/>
-        </w:rPr>
-        <w:t xml:space="preserve">   # Feature 3</w:t>
-      </w:r>
-    </w:p>
-    <w:p>
-      <w:pPr>
-        <w:shd w:val="clear" w:color="auto" w:fill="F2F2F2"/>
-        <w:ind w:left="240" w:right="240"/>
-      </w:pPr>
-      <w:r>
-        <w:rPr>
-          <w:rFonts w:ascii="Consolas" w:eastAsia="Consolas" w:hAnsi="Consolas" w:cs="Consolas"/>
-          <w:sz w:val="17"/>
-          <w:szCs w:val="17"/>
-        </w:rPr>
-        <w:t xml:space="preserve">    remove_</w:t>
-      </w:r>
-      <w:proofErr w:type="gramStart"/>
-      <w:r>
-        <w:rPr>
-          <w:rFonts w:ascii="Consolas" w:eastAsia="Consolas" w:hAnsi="Consolas" w:cs="Consolas"/>
-          <w:sz w:val="17"/>
-          <w:szCs w:val="17"/>
-        </w:rPr>
-        <w:t>product.feature</w:t>
-      </w:r>
-      <w:proofErr w:type="gramEnd"/>
-      <w:r>
-        <w:rPr>
-          <w:rFonts w:ascii="Consolas" w:eastAsia="Consolas" w:hAnsi="Consolas" w:cs="Consolas"/>
-          <w:sz w:val="17"/>
-          <w:szCs w:val="17"/>
-        </w:rPr>
-        <w:t xml:space="preserve">    # Feature 4</w:t>
-      </w:r>
-    </w:p>
-    <w:p>
-      <w:pPr>
-        <w:shd w:val="clear" w:color="auto" w:fill="F2F2F2"/>
-        <w:ind w:left="240" w:right="240"/>
-      </w:pPr>
-      <w:r>
-        <w:rPr>
-          <w:rFonts w:ascii="Consolas" w:eastAsia="Consolas" w:hAnsi="Consolas" w:cs="Consolas"/>
-          <w:sz w:val="17"/>
-          <w:szCs w:val="17"/>
-        </w:rPr>
-        <w:t xml:space="preserve">    search_</w:t>
-      </w:r>
-      <w:proofErr w:type="gramStart"/>
-      <w:r>
-        <w:rPr>
-          <w:rFonts w:ascii="Consolas" w:eastAsia="Consolas" w:hAnsi="Consolas" w:cs="Consolas"/>
-          <w:sz w:val="17"/>
-          <w:szCs w:val="17"/>
-        </w:rPr>
-        <w:t>product.feature</w:t>
-      </w:r>
-      <w:proofErr w:type="gramEnd"/>
-      <w:r>
-        <w:rPr>
-          <w:rFonts w:ascii="Consolas" w:eastAsia="Consolas" w:hAnsi="Consolas" w:cs="Consolas"/>
-          <w:sz w:val="17"/>
-          <w:szCs w:val="17"/>
-        </w:rPr>
-        <w:t xml:space="preserve">    # Feature 5 (añadida)</w:t>
+        <w:t xml:space="preserve">    environment.py            # Hooks de Behave (sys.path)</w:t>
+      </w:r>
+    </w:p>
+    <w:p>
+      <w:pPr>
+        <w:shd w:val="clear" w:color="auto" w:fill="F2F2F2"/>
+        <w:ind w:left="240" w:right="240"/>
+      </w:pPr>
+      <w:r>
+        <w:rPr>
+          <w:rFonts w:ascii="Consolas" w:eastAsia="Consolas" w:hAnsi="Consolas" w:cs="Consolas"/>
+          <w:sz w:val="17"/>
+          <w:szCs w:val="17"/>
+        </w:rPr>
+        <w:t xml:space="preserve">    add_product.feature       # Feature 1</w:t>
+      </w:r>
+    </w:p>
+    <w:p>
+      <w:pPr>
+        <w:shd w:val="clear" w:color="auto" w:fill="F2F2F2"/>
+        <w:ind w:left="240" w:right="240"/>
+      </w:pPr>
+      <w:r>
+        <w:rPr>
+          <w:rFonts w:ascii="Consolas" w:eastAsia="Consolas" w:hAnsi="Consolas" w:cs="Consolas"/>
+          <w:sz w:val="17"/>
+          <w:szCs w:val="17"/>
+        </w:rPr>
+        <w:t xml:space="preserve">    list_products.feature     # Feature 2</w:t>
+      </w:r>
+    </w:p>
+    <w:p>
+      <w:pPr>
+        <w:shd w:val="clear" w:color="auto" w:fill="F2F2F2"/>
+        <w:ind w:left="240" w:right="240"/>
+      </w:pPr>
+      <w:r>
+        <w:rPr>
+          <w:rFonts w:ascii="Consolas" w:eastAsia="Consolas" w:hAnsi="Consolas" w:cs="Consolas"/>
+          <w:sz w:val="17"/>
+          <w:szCs w:val="17"/>
+        </w:rPr>
+        <w:t xml:space="preserve">    update_quantity.feature   # Feature 3</w:t>
+      </w:r>
+    </w:p>
+    <w:p>
+      <w:pPr>
+        <w:shd w:val="clear" w:color="auto" w:fill="F2F2F2"/>
+        <w:ind w:left="240" w:right="240"/>
+      </w:pPr>
+      <w:r>
+        <w:rPr>
+          <w:rFonts w:ascii="Consolas" w:eastAsia="Consolas" w:hAnsi="Consolas" w:cs="Consolas"/>
+          <w:sz w:val="17"/>
+          <w:szCs w:val="17"/>
+        </w:rPr>
+        <w:t xml:space="preserve">    remove_product.feature    # Feature 4</w:t>
+      </w:r>
+    </w:p>
+    <w:p>
+      <w:pPr>
+        <w:shd w:val="clear" w:color="auto" w:fill="F2F2F2"/>
+        <w:ind w:left="240" w:right="240"/>
+      </w:pPr>
+      <w:r>
+        <w:rPr>
+          <w:rFonts w:ascii="Consolas" w:eastAsia="Consolas" w:hAnsi="Consolas" w:cs="Consolas"/>
+          <w:sz w:val="17"/>
+          <w:szCs w:val="17"/>
+        </w:rPr>
+        <w:t xml:space="preserve">    search_product.feature    # Feature 5 (añadida)</w:t>
       </w:r>
     </w:p>
     <w:p>
@@ -1907,43 +1780,7 @@
           <w:sz w:val="17"/>
           <w:szCs w:val="17"/>
         </w:rPr>
-        <w:t xml:space="preserve"># </w:t>
-      </w:r>
-      <w:proofErr w:type="gramStart"/>
-      <w:r>
-        <w:rPr>
-          <w:rFonts w:ascii="Consolas" w:eastAsia="Consolas" w:hAnsi="Consolas" w:cs="Consolas"/>
-          <w:sz w:val="17"/>
-          <w:szCs w:val="17"/>
-        </w:rPr>
-        <w:t>add</w:t>
-      </w:r>
-      <w:proofErr w:type="gramEnd"/>
-      <w:r>
-        <w:rPr>
-          <w:rFonts w:ascii="Consolas" w:eastAsia="Consolas" w:hAnsi="Consolas" w:cs="Consolas"/>
-          <w:sz w:val="17"/>
-          <w:szCs w:val="17"/>
-        </w:rPr>
-        <w:t>_</w:t>
-      </w:r>
-      <w:proofErr w:type="gramStart"/>
-      <w:r>
-        <w:rPr>
-          <w:rFonts w:ascii="Consolas" w:eastAsia="Consolas" w:hAnsi="Consolas" w:cs="Consolas"/>
-          <w:sz w:val="17"/>
-          <w:szCs w:val="17"/>
-        </w:rPr>
-        <w:t>product.feature</w:t>
-      </w:r>
-      <w:proofErr w:type="gramEnd"/>
-      <w:r>
-        <w:rPr>
-          <w:rFonts w:ascii="Consolas" w:eastAsia="Consolas" w:hAnsi="Consolas" w:cs="Consolas"/>
-          <w:sz w:val="17"/>
-          <w:szCs w:val="17"/>
-        </w:rPr>
-        <w:t xml:space="preserve"> -- Feature 1</w:t>
+        <w:t># add_product.feature -- Feature 1</w:t>
       </w:r>
     </w:p>
     <w:p>
@@ -2047,25 +1884,7 @@
           <w:sz w:val="17"/>
           <w:szCs w:val="17"/>
         </w:rPr>
-        <w:t># list_</w:t>
-      </w:r>
-      <w:proofErr w:type="gramStart"/>
-      <w:r>
-        <w:rPr>
-          <w:rFonts w:ascii="Consolas" w:eastAsia="Consolas" w:hAnsi="Consolas" w:cs="Consolas"/>
-          <w:sz w:val="17"/>
-          <w:szCs w:val="17"/>
-        </w:rPr>
-        <w:t>products.feature</w:t>
-      </w:r>
-      <w:proofErr w:type="gramEnd"/>
-      <w:r>
-        <w:rPr>
-          <w:rFonts w:ascii="Consolas" w:eastAsia="Consolas" w:hAnsi="Consolas" w:cs="Consolas"/>
-          <w:sz w:val="17"/>
-          <w:szCs w:val="17"/>
-        </w:rPr>
-        <w:t xml:space="preserve"> -- Feature 2</w:t>
+        <w:t># list_products.feature -- Feature 2</w:t>
       </w:r>
     </w:p>
     <w:p>
@@ -2108,25 +1927,7 @@
           <w:sz w:val="17"/>
           <w:szCs w:val="17"/>
         </w:rPr>
-        <w:t xml:space="preserve">  Scenario: </w:t>
-      </w:r>
-      <w:proofErr w:type="gramStart"/>
-      <w:r>
-        <w:rPr>
-          <w:rFonts w:ascii="Consolas" w:eastAsia="Consolas" w:hAnsi="Consolas" w:cs="Consolas"/>
-          <w:sz w:val="17"/>
-          <w:szCs w:val="17"/>
-        </w:rPr>
-        <w:t>List</w:t>
-      </w:r>
-      <w:proofErr w:type="gramEnd"/>
-      <w:r>
-        <w:rPr>
-          <w:rFonts w:ascii="Consolas" w:eastAsia="Consolas" w:hAnsi="Consolas" w:cs="Consolas"/>
-          <w:sz w:val="17"/>
-          <w:szCs w:val="17"/>
-        </w:rPr>
-        <w:t xml:space="preserve"> all products in the inventory</w:t>
+        <w:t xml:space="preserve">  Scenario: List all products in the inventory</w:t>
       </w:r>
     </w:p>
     <w:p>
@@ -2168,18 +1969,8 @@
           <w:sz w:val="17"/>
           <w:szCs w:val="17"/>
         </w:rPr>
-        <w:t xml:space="preserve">      | </w:t>
-      </w:r>
-      <w:proofErr w:type="gramStart"/>
-      <w:r>
-        <w:rPr>
-          <w:rFonts w:ascii="Consolas" w:eastAsia="Consolas" w:hAnsi="Consolas" w:cs="Consolas"/>
-          <w:sz w:val="17"/>
-          <w:szCs w:val="17"/>
-        </w:rPr>
-        <w:t>Coffee  |</w:t>
-      </w:r>
-      <w:proofErr w:type="gramEnd"/>
+        <w:t xml:space="preserve">      | Coffee  |</w:t>
+      </w:r>
     </w:p>
     <w:p>
       <w:pPr>
@@ -2310,25 +2101,7 @@
           <w:sz w:val="17"/>
           <w:szCs w:val="17"/>
         </w:rPr>
-        <w:t># update_</w:t>
-      </w:r>
-      <w:proofErr w:type="gramStart"/>
-      <w:r>
-        <w:rPr>
-          <w:rFonts w:ascii="Consolas" w:eastAsia="Consolas" w:hAnsi="Consolas" w:cs="Consolas"/>
-          <w:sz w:val="17"/>
-          <w:szCs w:val="17"/>
-        </w:rPr>
-        <w:t>quantity.feature</w:t>
-      </w:r>
-      <w:proofErr w:type="gramEnd"/>
-      <w:r>
-        <w:rPr>
-          <w:rFonts w:ascii="Consolas" w:eastAsia="Consolas" w:hAnsi="Consolas" w:cs="Consolas"/>
-          <w:sz w:val="17"/>
-          <w:szCs w:val="17"/>
-        </w:rPr>
-        <w:t xml:space="preserve"> -- Feature 3</w:t>
+        <w:t># update_quantity.feature -- Feature 3</w:t>
       </w:r>
     </w:p>
     <w:p>
@@ -2412,25 +2185,7 @@
           <w:sz w:val="17"/>
           <w:szCs w:val="17"/>
         </w:rPr>
-        <w:t xml:space="preserve">      | </w:t>
-      </w:r>
-      <w:proofErr w:type="gramStart"/>
-      <w:r>
-        <w:rPr>
-          <w:rFonts w:ascii="Consolas" w:eastAsia="Consolas" w:hAnsi="Consolas" w:cs="Consolas"/>
-          <w:sz w:val="17"/>
-          <w:szCs w:val="17"/>
-        </w:rPr>
-        <w:t>Coffee  |</w:t>
-      </w:r>
-      <w:proofErr w:type="gramEnd"/>
-      <w:r>
-        <w:rPr>
-          <w:rFonts w:ascii="Consolas" w:eastAsia="Consolas" w:hAnsi="Consolas" w:cs="Consolas"/>
-          <w:sz w:val="17"/>
-          <w:szCs w:val="17"/>
-        </w:rPr>
-        <w:t xml:space="preserve"> 10       |</w:t>
+        <w:t xml:space="preserve">      | Coffee  | 10       |</w:t>
       </w:r>
     </w:p>
     <w:p>
@@ -2478,43 +2233,7 @@
           <w:sz w:val="17"/>
           <w:szCs w:val="17"/>
         </w:rPr>
-        <w:t xml:space="preserve"># </w:t>
-      </w:r>
-      <w:proofErr w:type="gramStart"/>
-      <w:r>
-        <w:rPr>
-          <w:rFonts w:ascii="Consolas" w:eastAsia="Consolas" w:hAnsi="Consolas" w:cs="Consolas"/>
-          <w:sz w:val="17"/>
-          <w:szCs w:val="17"/>
-        </w:rPr>
-        <w:t>remove</w:t>
-      </w:r>
-      <w:proofErr w:type="gramEnd"/>
-      <w:r>
-        <w:rPr>
-          <w:rFonts w:ascii="Consolas" w:eastAsia="Consolas" w:hAnsi="Consolas" w:cs="Consolas"/>
-          <w:sz w:val="17"/>
-          <w:szCs w:val="17"/>
-        </w:rPr>
-        <w:t>_</w:t>
-      </w:r>
-      <w:proofErr w:type="gramStart"/>
-      <w:r>
-        <w:rPr>
-          <w:rFonts w:ascii="Consolas" w:eastAsia="Consolas" w:hAnsi="Consolas" w:cs="Consolas"/>
-          <w:sz w:val="17"/>
-          <w:szCs w:val="17"/>
-        </w:rPr>
-        <w:t>product.feature</w:t>
-      </w:r>
-      <w:proofErr w:type="gramEnd"/>
-      <w:r>
-        <w:rPr>
-          <w:rFonts w:ascii="Consolas" w:eastAsia="Consolas" w:hAnsi="Consolas" w:cs="Consolas"/>
-          <w:sz w:val="17"/>
-          <w:szCs w:val="17"/>
-        </w:rPr>
-        <w:t xml:space="preserve"> -- Feature 4</w:t>
+        <w:t># remove_product.feature -- Feature 4</w:t>
       </w:r>
     </w:p>
     <w:p>
@@ -2598,18 +2317,8 @@
           <w:sz w:val="17"/>
           <w:szCs w:val="17"/>
         </w:rPr>
-        <w:t xml:space="preserve">      | </w:t>
-      </w:r>
-      <w:proofErr w:type="gramStart"/>
-      <w:r>
-        <w:rPr>
-          <w:rFonts w:ascii="Consolas" w:eastAsia="Consolas" w:hAnsi="Consolas" w:cs="Consolas"/>
-          <w:sz w:val="17"/>
-          <w:szCs w:val="17"/>
-        </w:rPr>
-        <w:t>Coffee  |</w:t>
-      </w:r>
-      <w:proofErr w:type="gramEnd"/>
+        <w:t xml:space="preserve">      | Coffee  |</w:t>
+      </w:r>
     </w:p>
     <w:p>
       <w:pPr>
@@ -2670,57 +2379,21 @@
           <w:sz w:val="17"/>
           <w:szCs w:val="17"/>
         </w:rPr>
-        <w:t># search_</w:t>
-      </w:r>
-      <w:proofErr w:type="gramStart"/>
-      <w:r>
-        <w:rPr>
-          <w:rFonts w:ascii="Consolas" w:eastAsia="Consolas" w:hAnsi="Consolas" w:cs="Consolas"/>
-          <w:sz w:val="17"/>
-          <w:szCs w:val="17"/>
-        </w:rPr>
-        <w:t>product.feature</w:t>
-      </w:r>
-      <w:proofErr w:type="gramEnd"/>
-      <w:r>
-        <w:rPr>
-          <w:rFonts w:ascii="Consolas" w:eastAsia="Consolas" w:hAnsi="Consolas" w:cs="Consolas"/>
-          <w:sz w:val="17"/>
-          <w:szCs w:val="17"/>
-        </w:rPr>
-        <w:t xml:space="preserve"> -- Feature 5 (añadida, interacción fallida)</w:t>
-      </w:r>
-    </w:p>
-    <w:p>
-      <w:pPr>
-        <w:shd w:val="clear" w:color="auto" w:fill="F2F2F2"/>
-        <w:ind w:left="240" w:right="240"/>
-      </w:pPr>
-      <w:r>
-        <w:rPr>
-          <w:rFonts w:ascii="Consolas" w:eastAsia="Consolas" w:hAnsi="Consolas" w:cs="Consolas"/>
-          <w:sz w:val="17"/>
-          <w:szCs w:val="17"/>
-        </w:rPr>
-        <w:t xml:space="preserve">Feature: </w:t>
-      </w:r>
-      <w:proofErr w:type="gramStart"/>
-      <w:r>
-        <w:rPr>
-          <w:rFonts w:ascii="Consolas" w:eastAsia="Consolas" w:hAnsi="Consolas" w:cs="Consolas"/>
-          <w:sz w:val="17"/>
-          <w:szCs w:val="17"/>
-        </w:rPr>
-        <w:t>Search</w:t>
-      </w:r>
-      <w:proofErr w:type="gramEnd"/>
-      <w:r>
-        <w:rPr>
-          <w:rFonts w:ascii="Consolas" w:eastAsia="Consolas" w:hAnsi="Consolas" w:cs="Consolas"/>
-          <w:sz w:val="17"/>
-          <w:szCs w:val="17"/>
-        </w:rPr>
-        <w:t xml:space="preserve"> a product by name</w:t>
+        <w:t># search_product.feature -- Feature 5 (añadida, interacción fallida)</w:t>
+      </w:r>
+    </w:p>
+    <w:p>
+      <w:pPr>
+        <w:shd w:val="clear" w:color="auto" w:fill="F2F2F2"/>
+        <w:ind w:left="240" w:right="240"/>
+      </w:pPr>
+      <w:r>
+        <w:rPr>
+          <w:rFonts w:ascii="Consolas" w:eastAsia="Consolas" w:hAnsi="Consolas" w:cs="Consolas"/>
+          <w:sz w:val="17"/>
+          <w:szCs w:val="17"/>
+        </w:rPr>
+        <w:t>Feature: Search a product by name</w:t>
       </w:r>
     </w:p>
     <w:p>
@@ -2926,25 +2599,7 @@
           <w:sz w:val="17"/>
           <w:szCs w:val="17"/>
         </w:rPr>
-        <w:t>@</w:t>
-      </w:r>
-      <w:proofErr w:type="gramStart"/>
-      <w:r>
-        <w:rPr>
-          <w:rFonts w:ascii="Consolas" w:eastAsia="Consolas" w:hAnsi="Consolas" w:cs="Consolas"/>
-          <w:sz w:val="17"/>
-          <w:szCs w:val="17"/>
-        </w:rPr>
-        <w:t>given(</w:t>
-      </w:r>
-      <w:proofErr w:type="gramEnd"/>
-      <w:r>
-        <w:rPr>
-          <w:rFonts w:ascii="Consolas" w:eastAsia="Consolas" w:hAnsi="Consolas" w:cs="Consolas"/>
-          <w:sz w:val="17"/>
-          <w:szCs w:val="17"/>
-        </w:rPr>
-        <w:t>'the inventory is empty')</w:t>
+        <w:t>@given('the inventory is empty')</w:t>
       </w:r>
     </w:p>
     <w:p>
@@ -2972,43 +2627,7 @@
           <w:sz w:val="17"/>
           <w:szCs w:val="17"/>
         </w:rPr>
-        <w:t xml:space="preserve">    </w:t>
-      </w:r>
-      <w:proofErr w:type="gramStart"/>
-      <w:r>
-        <w:rPr>
-          <w:rFonts w:ascii="Consolas" w:eastAsia="Consolas" w:hAnsi="Consolas" w:cs="Consolas"/>
-          <w:sz w:val="17"/>
-          <w:szCs w:val="17"/>
-        </w:rPr>
-        <w:t>context.inventory</w:t>
-      </w:r>
-      <w:proofErr w:type="gramEnd"/>
-      <w:r>
-        <w:rPr>
-          <w:rFonts w:ascii="Consolas" w:eastAsia="Consolas" w:hAnsi="Consolas" w:cs="Consolas"/>
-          <w:sz w:val="17"/>
-          <w:szCs w:val="17"/>
-        </w:rPr>
-        <w:t xml:space="preserve"> = </w:t>
-      </w:r>
-      <w:proofErr w:type="gramStart"/>
-      <w:r>
-        <w:rPr>
-          <w:rFonts w:ascii="Consolas" w:eastAsia="Consolas" w:hAnsi="Consolas" w:cs="Consolas"/>
-          <w:sz w:val="17"/>
-          <w:szCs w:val="17"/>
-        </w:rPr>
-        <w:t>Inventory(</w:t>
-      </w:r>
-      <w:proofErr w:type="gramEnd"/>
-      <w:r>
-        <w:rPr>
-          <w:rFonts w:ascii="Consolas" w:eastAsia="Consolas" w:hAnsi="Consolas" w:cs="Consolas"/>
-          <w:sz w:val="17"/>
-          <w:szCs w:val="17"/>
-        </w:rPr>
-        <w:t>)</w:t>
+        <w:t xml:space="preserve">    context.inventory = Inventory()</w:t>
       </w:r>
     </w:p>
     <w:p>
@@ -3036,25 +2655,7 @@
           <w:sz w:val="17"/>
           <w:szCs w:val="17"/>
         </w:rPr>
-        <w:t>@</w:t>
-      </w:r>
-      <w:proofErr w:type="gramStart"/>
-      <w:r>
-        <w:rPr>
-          <w:rFonts w:ascii="Consolas" w:eastAsia="Consolas" w:hAnsi="Consolas" w:cs="Consolas"/>
-          <w:sz w:val="17"/>
-          <w:szCs w:val="17"/>
-        </w:rPr>
-        <w:t>given(</w:t>
-      </w:r>
-      <w:proofErr w:type="gramEnd"/>
-      <w:r>
-        <w:rPr>
-          <w:rFonts w:ascii="Consolas" w:eastAsia="Consolas" w:hAnsi="Consolas" w:cs="Consolas"/>
-          <w:sz w:val="17"/>
-          <w:szCs w:val="17"/>
-        </w:rPr>
-        <w:t>'the inventory contains products:')</w:t>
+        <w:t>@given('the inventory contains products:')</w:t>
       </w:r>
     </w:p>
     <w:p>
@@ -3082,75 +2683,21 @@
           <w:sz w:val="17"/>
           <w:szCs w:val="17"/>
         </w:rPr>
-        <w:t xml:space="preserve">    </w:t>
-      </w:r>
-      <w:proofErr w:type="gramStart"/>
-      <w:r>
-        <w:rPr>
-          <w:rFonts w:ascii="Consolas" w:eastAsia="Consolas" w:hAnsi="Consolas" w:cs="Consolas"/>
-          <w:sz w:val="17"/>
-          <w:szCs w:val="17"/>
-        </w:rPr>
-        <w:t>context.inventory</w:t>
-      </w:r>
-      <w:proofErr w:type="gramEnd"/>
-      <w:r>
-        <w:rPr>
-          <w:rFonts w:ascii="Consolas" w:eastAsia="Consolas" w:hAnsi="Consolas" w:cs="Consolas"/>
-          <w:sz w:val="17"/>
-          <w:szCs w:val="17"/>
-        </w:rPr>
-        <w:t xml:space="preserve"> = </w:t>
-      </w:r>
-      <w:proofErr w:type="gramStart"/>
-      <w:r>
-        <w:rPr>
-          <w:rFonts w:ascii="Consolas" w:eastAsia="Consolas" w:hAnsi="Consolas" w:cs="Consolas"/>
-          <w:sz w:val="17"/>
-          <w:szCs w:val="17"/>
-        </w:rPr>
-        <w:t>Inventory(</w:t>
-      </w:r>
-      <w:proofErr w:type="gramEnd"/>
-      <w:r>
-        <w:rPr>
-          <w:rFonts w:ascii="Consolas" w:eastAsia="Consolas" w:hAnsi="Consolas" w:cs="Consolas"/>
-          <w:sz w:val="17"/>
-          <w:szCs w:val="17"/>
-        </w:rPr>
-        <w:t>)</w:t>
-      </w:r>
-    </w:p>
-    <w:p>
-      <w:pPr>
-        <w:shd w:val="clear" w:color="auto" w:fill="F2F2F2"/>
-        <w:ind w:left="240" w:right="240"/>
-      </w:pPr>
-      <w:r>
-        <w:rPr>
-          <w:rFonts w:ascii="Consolas" w:eastAsia="Consolas" w:hAnsi="Consolas" w:cs="Consolas"/>
-          <w:sz w:val="17"/>
-          <w:szCs w:val="17"/>
-        </w:rPr>
-        <w:t xml:space="preserve">    for row in </w:t>
-      </w:r>
-      <w:proofErr w:type="gramStart"/>
-      <w:r>
-        <w:rPr>
-          <w:rFonts w:ascii="Consolas" w:eastAsia="Consolas" w:hAnsi="Consolas" w:cs="Consolas"/>
-          <w:sz w:val="17"/>
-          <w:szCs w:val="17"/>
-        </w:rPr>
-        <w:t>context.table</w:t>
-      </w:r>
-      <w:proofErr w:type="gramEnd"/>
-      <w:r>
-        <w:rPr>
-          <w:rFonts w:ascii="Consolas" w:eastAsia="Consolas" w:hAnsi="Consolas" w:cs="Consolas"/>
-          <w:sz w:val="17"/>
-          <w:szCs w:val="17"/>
-        </w:rPr>
-        <w:t>:</w:t>
+        <w:t xml:space="preserve">    context.inventory = Inventory()</w:t>
+      </w:r>
+    </w:p>
+    <w:p>
+      <w:pPr>
+        <w:shd w:val="clear" w:color="auto" w:fill="F2F2F2"/>
+        <w:ind w:left="240" w:right="240"/>
+      </w:pPr>
+      <w:r>
+        <w:rPr>
+          <w:rFonts w:ascii="Consolas" w:eastAsia="Consolas" w:hAnsi="Consolas" w:cs="Consolas"/>
+          <w:sz w:val="17"/>
+          <w:szCs w:val="17"/>
+        </w:rPr>
+        <w:t xml:space="preserve">    for row in context.table:</w:t>
       </w:r>
     </w:p>
     <w:p>
@@ -3179,57 +2726,21 @@
           <w:sz w:val="17"/>
           <w:szCs w:val="17"/>
         </w:rPr>
-        <w:t xml:space="preserve">        if 'Quantity' in </w:t>
-      </w:r>
-      <w:proofErr w:type="gramStart"/>
-      <w:r>
-        <w:rPr>
-          <w:rFonts w:ascii="Consolas" w:eastAsia="Consolas" w:hAnsi="Consolas" w:cs="Consolas"/>
-          <w:sz w:val="17"/>
-          <w:szCs w:val="17"/>
-        </w:rPr>
-        <w:t>row.headings</w:t>
-      </w:r>
-      <w:proofErr w:type="gramEnd"/>
-      <w:r>
-        <w:rPr>
-          <w:rFonts w:ascii="Consolas" w:eastAsia="Consolas" w:hAnsi="Consolas" w:cs="Consolas"/>
-          <w:sz w:val="17"/>
-          <w:szCs w:val="17"/>
-        </w:rPr>
-        <w:t>:</w:t>
-      </w:r>
-    </w:p>
-    <w:p>
-      <w:pPr>
-        <w:shd w:val="clear" w:color="auto" w:fill="F2F2F2"/>
-        <w:ind w:left="240" w:right="240"/>
-      </w:pPr>
-      <w:r>
-        <w:rPr>
-          <w:rFonts w:ascii="Consolas" w:eastAsia="Consolas" w:hAnsi="Consolas" w:cs="Consolas"/>
-          <w:sz w:val="17"/>
-          <w:szCs w:val="17"/>
-        </w:rPr>
-        <w:t xml:space="preserve">            context.inventory.add_</w:t>
-      </w:r>
-      <w:proofErr w:type="gramStart"/>
-      <w:r>
-        <w:rPr>
-          <w:rFonts w:ascii="Consolas" w:eastAsia="Consolas" w:hAnsi="Consolas" w:cs="Consolas"/>
-          <w:sz w:val="17"/>
-          <w:szCs w:val="17"/>
-        </w:rPr>
-        <w:t>product(</w:t>
-      </w:r>
-      <w:proofErr w:type="gramEnd"/>
-      <w:r>
-        <w:rPr>
-          <w:rFonts w:ascii="Consolas" w:eastAsia="Consolas" w:hAnsi="Consolas" w:cs="Consolas"/>
-          <w:sz w:val="17"/>
-          <w:szCs w:val="17"/>
-        </w:rPr>
-        <w:t>name, quantity=int(row['Quantity']))</w:t>
+        <w:t xml:space="preserve">        if 'Quantity' in row.headings:</w:t>
+      </w:r>
+    </w:p>
+    <w:p>
+      <w:pPr>
+        <w:shd w:val="clear" w:color="auto" w:fill="F2F2F2"/>
+        <w:ind w:left="240" w:right="240"/>
+      </w:pPr>
+      <w:r>
+        <w:rPr>
+          <w:rFonts w:ascii="Consolas" w:eastAsia="Consolas" w:hAnsi="Consolas" w:cs="Consolas"/>
+          <w:sz w:val="17"/>
+          <w:szCs w:val="17"/>
+        </w:rPr>
+        <w:t xml:space="preserve">            context.inventory.add_product(name, quantity=int(row['Quantity']))</w:t>
       </w:r>
     </w:p>
     <w:p>
@@ -3319,107 +2830,35 @@
           <w:sz w:val="17"/>
           <w:szCs w:val="17"/>
         </w:rPr>
-        <w:t>@</w:t>
-      </w:r>
-      <w:proofErr w:type="gramStart"/>
-      <w:r>
-        <w:rPr>
-          <w:rFonts w:ascii="Consolas" w:eastAsia="Consolas" w:hAnsi="Consolas" w:cs="Consolas"/>
-          <w:sz w:val="17"/>
-          <w:szCs w:val="17"/>
-        </w:rPr>
-        <w:t>when(</w:t>
-      </w:r>
-      <w:proofErr w:type="gramEnd"/>
-      <w:r>
-        <w:rPr>
-          <w:rFonts w:ascii="Consolas" w:eastAsia="Consolas" w:hAnsi="Consolas" w:cs="Consolas"/>
-          <w:sz w:val="17"/>
-          <w:szCs w:val="17"/>
-        </w:rPr>
-        <w:t xml:space="preserve">'the user adds a </w:t>
-      </w:r>
-      <w:proofErr w:type="gramStart"/>
-      <w:r>
-        <w:rPr>
-          <w:rFonts w:ascii="Consolas" w:eastAsia="Consolas" w:hAnsi="Consolas" w:cs="Consolas"/>
-          <w:sz w:val="17"/>
-          <w:szCs w:val="17"/>
-        </w:rPr>
-        <w:t>product "{product}"</w:t>
-      </w:r>
-      <w:proofErr w:type="gramEnd"/>
-      <w:r>
-        <w:rPr>
-          <w:rFonts w:ascii="Consolas" w:eastAsia="Consolas" w:hAnsi="Consolas" w:cs="Consolas"/>
-          <w:sz w:val="17"/>
-          <w:szCs w:val="17"/>
-        </w:rPr>
-        <w:t>')</w:t>
-      </w:r>
-    </w:p>
-    <w:p>
-      <w:pPr>
-        <w:shd w:val="clear" w:color="auto" w:fill="F2F2F2"/>
-        <w:ind w:left="240" w:right="240"/>
-      </w:pPr>
-      <w:r>
-        <w:rPr>
-          <w:rFonts w:ascii="Consolas" w:eastAsia="Consolas" w:hAnsi="Consolas" w:cs="Consolas"/>
-          <w:sz w:val="17"/>
-          <w:szCs w:val="17"/>
-        </w:rPr>
-        <w:t>def step_</w:t>
-      </w:r>
-      <w:proofErr w:type="gramStart"/>
-      <w:r>
-        <w:rPr>
-          <w:rFonts w:ascii="Consolas" w:eastAsia="Consolas" w:hAnsi="Consolas" w:cs="Consolas"/>
-          <w:sz w:val="17"/>
-          <w:szCs w:val="17"/>
-        </w:rPr>
-        <w:t>impl(</w:t>
-      </w:r>
-      <w:proofErr w:type="gramEnd"/>
-      <w:r>
-        <w:rPr>
-          <w:rFonts w:ascii="Consolas" w:eastAsia="Consolas" w:hAnsi="Consolas" w:cs="Consolas"/>
-          <w:sz w:val="17"/>
-          <w:szCs w:val="17"/>
-        </w:rPr>
-        <w:t>context, product):</w:t>
-      </w:r>
-    </w:p>
-    <w:p>
-      <w:pPr>
-        <w:shd w:val="clear" w:color="auto" w:fill="F2F2F2"/>
-        <w:ind w:left="240" w:right="240"/>
-      </w:pPr>
-      <w:r>
-        <w:rPr>
-          <w:rFonts w:ascii="Consolas" w:eastAsia="Consolas" w:hAnsi="Consolas" w:cs="Consolas"/>
-          <w:sz w:val="17"/>
-          <w:szCs w:val="17"/>
-        </w:rPr>
-        <w:t xml:space="preserve">    </w:t>
-      </w:r>
-      <w:proofErr w:type="gramStart"/>
-      <w:r>
-        <w:rPr>
-          <w:rFonts w:ascii="Consolas" w:eastAsia="Consolas" w:hAnsi="Consolas" w:cs="Consolas"/>
-          <w:sz w:val="17"/>
-          <w:szCs w:val="17"/>
-        </w:rPr>
-        <w:t>context.output</w:t>
-      </w:r>
-      <w:proofErr w:type="gramEnd"/>
-      <w:r>
-        <w:rPr>
-          <w:rFonts w:ascii="Consolas" w:eastAsia="Consolas" w:hAnsi="Consolas" w:cs="Consolas"/>
-          <w:sz w:val="17"/>
-          <w:szCs w:val="17"/>
-        </w:rPr>
-        <w:t xml:space="preserve"> = context.inventory.add_product(product)</w:t>
+        <w:t>@when('the user adds a product "{product}"')</w:t>
+      </w:r>
+    </w:p>
+    <w:p>
+      <w:pPr>
+        <w:shd w:val="clear" w:color="auto" w:fill="F2F2F2"/>
+        <w:ind w:left="240" w:right="240"/>
+      </w:pPr>
+      <w:r>
+        <w:rPr>
+          <w:rFonts w:ascii="Consolas" w:eastAsia="Consolas" w:hAnsi="Consolas" w:cs="Consolas"/>
+          <w:sz w:val="17"/>
+          <w:szCs w:val="17"/>
+        </w:rPr>
+        <w:t>def step_impl(context, product):</w:t>
+      </w:r>
+    </w:p>
+    <w:p>
+      <w:pPr>
+        <w:shd w:val="clear" w:color="auto" w:fill="F2F2F2"/>
+        <w:ind w:left="240" w:right="240"/>
+      </w:pPr>
+      <w:r>
+        <w:rPr>
+          <w:rFonts w:ascii="Consolas" w:eastAsia="Consolas" w:hAnsi="Consolas" w:cs="Consolas"/>
+          <w:sz w:val="17"/>
+          <w:szCs w:val="17"/>
+        </w:rPr>
+        <w:t xml:space="preserve">    context.output = context.inventory.add_product(product)</w:t>
       </w:r>
     </w:p>
     <w:p>
@@ -3447,139 +2886,49 @@
           <w:sz w:val="17"/>
           <w:szCs w:val="17"/>
         </w:rPr>
-        <w:t>@</w:t>
-      </w:r>
-      <w:proofErr w:type="gramStart"/>
-      <w:r>
-        <w:rPr>
-          <w:rFonts w:ascii="Consolas" w:eastAsia="Consolas" w:hAnsi="Consolas" w:cs="Consolas"/>
-          <w:sz w:val="17"/>
-          <w:szCs w:val="17"/>
-        </w:rPr>
-        <w:t>then(</w:t>
-      </w:r>
-      <w:proofErr w:type="gramEnd"/>
-      <w:r>
-        <w:rPr>
-          <w:rFonts w:ascii="Consolas" w:eastAsia="Consolas" w:hAnsi="Consolas" w:cs="Consolas"/>
-          <w:sz w:val="17"/>
-          <w:szCs w:val="17"/>
-        </w:rPr>
-        <w:t xml:space="preserve">'the inventory should </w:t>
-      </w:r>
-      <w:proofErr w:type="gramStart"/>
-      <w:r>
-        <w:rPr>
-          <w:rFonts w:ascii="Consolas" w:eastAsia="Consolas" w:hAnsi="Consolas" w:cs="Consolas"/>
-          <w:sz w:val="17"/>
-          <w:szCs w:val="17"/>
-        </w:rPr>
-        <w:t>contain "{product}"</w:t>
-      </w:r>
-      <w:proofErr w:type="gramEnd"/>
-      <w:r>
-        <w:rPr>
-          <w:rFonts w:ascii="Consolas" w:eastAsia="Consolas" w:hAnsi="Consolas" w:cs="Consolas"/>
-          <w:sz w:val="17"/>
-          <w:szCs w:val="17"/>
-        </w:rPr>
-        <w:t>')</w:t>
-      </w:r>
-    </w:p>
-    <w:p>
-      <w:pPr>
-        <w:shd w:val="clear" w:color="auto" w:fill="F2F2F2"/>
-        <w:ind w:left="240" w:right="240"/>
-      </w:pPr>
-      <w:r>
-        <w:rPr>
-          <w:rFonts w:ascii="Consolas" w:eastAsia="Consolas" w:hAnsi="Consolas" w:cs="Consolas"/>
-          <w:sz w:val="17"/>
-          <w:szCs w:val="17"/>
-        </w:rPr>
-        <w:t>def step_</w:t>
-      </w:r>
-      <w:proofErr w:type="gramStart"/>
-      <w:r>
-        <w:rPr>
-          <w:rFonts w:ascii="Consolas" w:eastAsia="Consolas" w:hAnsi="Consolas" w:cs="Consolas"/>
-          <w:sz w:val="17"/>
-          <w:szCs w:val="17"/>
-        </w:rPr>
-        <w:t>impl(</w:t>
-      </w:r>
-      <w:proofErr w:type="gramEnd"/>
-      <w:r>
-        <w:rPr>
-          <w:rFonts w:ascii="Consolas" w:eastAsia="Consolas" w:hAnsi="Consolas" w:cs="Consolas"/>
-          <w:sz w:val="17"/>
-          <w:szCs w:val="17"/>
-        </w:rPr>
-        <w:t>context, product):</w:t>
-      </w:r>
-    </w:p>
-    <w:p>
-      <w:pPr>
-        <w:shd w:val="clear" w:color="auto" w:fill="F2F2F2"/>
-        <w:ind w:left="240" w:right="240"/>
-      </w:pPr>
-      <w:r>
-        <w:rPr>
-          <w:rFonts w:ascii="Consolas" w:eastAsia="Consolas" w:hAnsi="Consolas" w:cs="Consolas"/>
-          <w:sz w:val="17"/>
-          <w:szCs w:val="17"/>
-        </w:rPr>
-        <w:t xml:space="preserve">    assert </w:t>
-      </w:r>
-      <w:proofErr w:type="gramStart"/>
-      <w:r>
-        <w:rPr>
-          <w:rFonts w:ascii="Consolas" w:eastAsia="Consolas" w:hAnsi="Consolas" w:cs="Consolas"/>
-          <w:sz w:val="17"/>
-          <w:szCs w:val="17"/>
-        </w:rPr>
-        <w:t>context.inventory</w:t>
-      </w:r>
-      <w:proofErr w:type="gramEnd"/>
-      <w:r>
-        <w:rPr>
-          <w:rFonts w:ascii="Consolas" w:eastAsia="Consolas" w:hAnsi="Consolas" w:cs="Consolas"/>
-          <w:sz w:val="17"/>
-          <w:szCs w:val="17"/>
-        </w:rPr>
-        <w:t>.contains(product), \</w:t>
-      </w:r>
-    </w:p>
-    <w:p>
-      <w:pPr>
-        <w:shd w:val="clear" w:color="auto" w:fill="F2F2F2"/>
-        <w:ind w:left="240" w:right="240"/>
-      </w:pPr>
-      <w:r>
-        <w:rPr>
-          <w:rFonts w:ascii="Consolas" w:eastAsia="Consolas" w:hAnsi="Consolas" w:cs="Consolas"/>
-          <w:sz w:val="17"/>
-          <w:szCs w:val="17"/>
-        </w:rPr>
-        <w:t xml:space="preserve">        </w:t>
-      </w:r>
-      <w:proofErr w:type="gramStart"/>
-      <w:r>
-        <w:rPr>
-          <w:rFonts w:ascii="Consolas" w:eastAsia="Consolas" w:hAnsi="Consolas" w:cs="Consolas"/>
-          <w:sz w:val="17"/>
-          <w:szCs w:val="17"/>
-        </w:rPr>
-        <w:t>f'Product "{product}"</w:t>
-      </w:r>
-      <w:proofErr w:type="gramEnd"/>
-      <w:r>
-        <w:rPr>
-          <w:rFonts w:ascii="Consolas" w:eastAsia="Consolas" w:hAnsi="Consolas" w:cs="Consolas"/>
-          <w:sz w:val="17"/>
-          <w:szCs w:val="17"/>
-        </w:rPr>
-        <w:t xml:space="preserve"> not found in the inventory'</w:t>
+        <w:t>@then('the inventory should contain "{product}"')</w:t>
+      </w:r>
+    </w:p>
+    <w:p>
+      <w:pPr>
+        <w:shd w:val="clear" w:color="auto" w:fill="F2F2F2"/>
+        <w:ind w:left="240" w:right="240"/>
+      </w:pPr>
+      <w:r>
+        <w:rPr>
+          <w:rFonts w:ascii="Consolas" w:eastAsia="Consolas" w:hAnsi="Consolas" w:cs="Consolas"/>
+          <w:sz w:val="17"/>
+          <w:szCs w:val="17"/>
+        </w:rPr>
+        <w:t>def step_impl(context, product):</w:t>
+      </w:r>
+    </w:p>
+    <w:p>
+      <w:pPr>
+        <w:shd w:val="clear" w:color="auto" w:fill="F2F2F2"/>
+        <w:ind w:left="240" w:right="240"/>
+      </w:pPr>
+      <w:r>
+        <w:rPr>
+          <w:rFonts w:ascii="Consolas" w:eastAsia="Consolas" w:hAnsi="Consolas" w:cs="Consolas"/>
+          <w:sz w:val="17"/>
+          <w:szCs w:val="17"/>
+        </w:rPr>
+        <w:t xml:space="preserve">    assert context.inventory.contains(product), \</w:t>
+      </w:r>
+    </w:p>
+    <w:p>
+      <w:pPr>
+        <w:shd w:val="clear" w:color="auto" w:fill="F2F2F2"/>
+        <w:ind w:left="240" w:right="240"/>
+      </w:pPr>
+      <w:r>
+        <w:rPr>
+          <w:rFonts w:ascii="Consolas" w:eastAsia="Consolas" w:hAnsi="Consolas" w:cs="Consolas"/>
+          <w:sz w:val="17"/>
+          <w:szCs w:val="17"/>
+        </w:rPr>
+        <w:t xml:space="preserve">        f'Product "{product}" not found in the inventory'</w:t>
       </w:r>
     </w:p>
     <w:p>
@@ -3613,25 +2962,7 @@
           <w:sz w:val="17"/>
           <w:szCs w:val="17"/>
         </w:rPr>
-        <w:t>@</w:t>
-      </w:r>
-      <w:proofErr w:type="gramStart"/>
-      <w:r>
-        <w:rPr>
-          <w:rFonts w:ascii="Consolas" w:eastAsia="Consolas" w:hAnsi="Consolas" w:cs="Consolas"/>
-          <w:sz w:val="17"/>
-          <w:szCs w:val="17"/>
-        </w:rPr>
-        <w:t>when(</w:t>
-      </w:r>
-      <w:proofErr w:type="gramEnd"/>
-      <w:r>
-        <w:rPr>
-          <w:rFonts w:ascii="Consolas" w:eastAsia="Consolas" w:hAnsi="Consolas" w:cs="Consolas"/>
-          <w:sz w:val="17"/>
-          <w:szCs w:val="17"/>
-        </w:rPr>
-        <w:t>'the user lists all products')</w:t>
+        <w:t>@when('the user lists all products')</w:t>
       </w:r>
     </w:p>
     <w:p>
@@ -3659,61 +2990,7 @@
           <w:sz w:val="17"/>
           <w:szCs w:val="17"/>
         </w:rPr>
-        <w:t xml:space="preserve">    </w:t>
-      </w:r>
-      <w:proofErr w:type="gramStart"/>
-      <w:r>
-        <w:rPr>
-          <w:rFonts w:ascii="Consolas" w:eastAsia="Consolas" w:hAnsi="Consolas" w:cs="Consolas"/>
-          <w:sz w:val="17"/>
-          <w:szCs w:val="17"/>
-        </w:rPr>
-        <w:t>context.output</w:t>
-      </w:r>
-      <w:proofErr w:type="gramEnd"/>
-      <w:r>
-        <w:rPr>
-          <w:rFonts w:ascii="Consolas" w:eastAsia="Consolas" w:hAnsi="Consolas" w:cs="Consolas"/>
-          <w:sz w:val="17"/>
-          <w:szCs w:val="17"/>
-        </w:rPr>
-        <w:t xml:space="preserve"> = </w:t>
-      </w:r>
-      <w:proofErr w:type="gramStart"/>
-      <w:r>
-        <w:rPr>
-          <w:rFonts w:ascii="Consolas" w:eastAsia="Consolas" w:hAnsi="Consolas" w:cs="Consolas"/>
-          <w:sz w:val="17"/>
-          <w:szCs w:val="17"/>
-        </w:rPr>
-        <w:t>context.inventory</w:t>
-      </w:r>
-      <w:proofErr w:type="gramEnd"/>
-      <w:r>
-        <w:rPr>
-          <w:rFonts w:ascii="Consolas" w:eastAsia="Consolas" w:hAnsi="Consolas" w:cs="Consolas"/>
-          <w:sz w:val="17"/>
-          <w:szCs w:val="17"/>
-        </w:rPr>
-        <w:t>.list_</w:t>
-      </w:r>
-      <w:proofErr w:type="gramStart"/>
-      <w:r>
-        <w:rPr>
-          <w:rFonts w:ascii="Consolas" w:eastAsia="Consolas" w:hAnsi="Consolas" w:cs="Consolas"/>
-          <w:sz w:val="17"/>
-          <w:szCs w:val="17"/>
-        </w:rPr>
-        <w:t>products(</w:t>
-      </w:r>
-      <w:proofErr w:type="gramEnd"/>
-      <w:r>
-        <w:rPr>
-          <w:rFonts w:ascii="Consolas" w:eastAsia="Consolas" w:hAnsi="Consolas" w:cs="Consolas"/>
-          <w:sz w:val="17"/>
-          <w:szCs w:val="17"/>
-        </w:rPr>
-        <w:t>)</w:t>
+        <w:t xml:space="preserve">    context.output = context.inventory.list_products()</w:t>
       </w:r>
     </w:p>
     <w:p>
@@ -3741,25 +3018,7 @@
           <w:sz w:val="17"/>
           <w:szCs w:val="17"/>
         </w:rPr>
-        <w:t>@</w:t>
-      </w:r>
-      <w:proofErr w:type="gramStart"/>
-      <w:r>
-        <w:rPr>
-          <w:rFonts w:ascii="Consolas" w:eastAsia="Consolas" w:hAnsi="Consolas" w:cs="Consolas"/>
-          <w:sz w:val="17"/>
-          <w:szCs w:val="17"/>
-        </w:rPr>
-        <w:t>then(</w:t>
-      </w:r>
-      <w:proofErr w:type="gramEnd"/>
-      <w:r>
-        <w:rPr>
-          <w:rFonts w:ascii="Consolas" w:eastAsia="Consolas" w:hAnsi="Consolas" w:cs="Consolas"/>
-          <w:sz w:val="17"/>
-          <w:szCs w:val="17"/>
-        </w:rPr>
-        <w:t>'the output should contain:')</w:t>
+        <w:t>@then('the output should contain:')</w:t>
       </w:r>
     </w:p>
     <w:p>
@@ -3787,89 +3046,35 @@
           <w:sz w:val="17"/>
           <w:szCs w:val="17"/>
         </w:rPr>
-        <w:t xml:space="preserve">    expected = context.</w:t>
-      </w:r>
-      <w:proofErr w:type="gramStart"/>
-      <w:r>
-        <w:rPr>
-          <w:rFonts w:ascii="Consolas" w:eastAsia="Consolas" w:hAnsi="Consolas" w:cs="Consolas"/>
-          <w:sz w:val="17"/>
-          <w:szCs w:val="17"/>
-        </w:rPr>
-        <w:t>text.strip</w:t>
-      </w:r>
-      <w:proofErr w:type="gramEnd"/>
-      <w:r>
-        <w:rPr>
-          <w:rFonts w:ascii="Consolas" w:eastAsia="Consolas" w:hAnsi="Consolas" w:cs="Consolas"/>
-          <w:sz w:val="17"/>
-          <w:szCs w:val="17"/>
-        </w:rPr>
-        <w:t>()</w:t>
-      </w:r>
-    </w:p>
-    <w:p>
-      <w:pPr>
-        <w:shd w:val="clear" w:color="auto" w:fill="F2F2F2"/>
-        <w:ind w:left="240" w:right="240"/>
-      </w:pPr>
-      <w:r>
-        <w:rPr>
-          <w:rFonts w:ascii="Consolas" w:eastAsia="Consolas" w:hAnsi="Consolas" w:cs="Consolas"/>
-          <w:sz w:val="17"/>
-          <w:szCs w:val="17"/>
-        </w:rPr>
-        <w:t xml:space="preserve">    assert expected in </w:t>
-      </w:r>
-      <w:proofErr w:type="gramStart"/>
-      <w:r>
-        <w:rPr>
-          <w:rFonts w:ascii="Consolas" w:eastAsia="Consolas" w:hAnsi="Consolas" w:cs="Consolas"/>
-          <w:sz w:val="17"/>
-          <w:szCs w:val="17"/>
-        </w:rPr>
-        <w:t>context.output</w:t>
-      </w:r>
-      <w:proofErr w:type="gramEnd"/>
-      <w:r>
-        <w:rPr>
-          <w:rFonts w:ascii="Consolas" w:eastAsia="Consolas" w:hAnsi="Consolas" w:cs="Consolas"/>
-          <w:sz w:val="17"/>
-          <w:szCs w:val="17"/>
-        </w:rPr>
-        <w:t>, \</w:t>
-      </w:r>
-    </w:p>
-    <w:p>
-      <w:pPr>
-        <w:shd w:val="clear" w:color="auto" w:fill="F2F2F2"/>
-        <w:ind w:left="240" w:right="240"/>
-      </w:pPr>
-      <w:r>
-        <w:rPr>
-          <w:rFonts w:ascii="Consolas" w:eastAsia="Consolas" w:hAnsi="Consolas" w:cs="Consolas"/>
-          <w:sz w:val="17"/>
-          <w:szCs w:val="17"/>
-        </w:rPr>
-        <w:t xml:space="preserve">        f'Expected to find:\n{expected}\nbut got:\n{</w:t>
-      </w:r>
-      <w:proofErr w:type="gramStart"/>
-      <w:r>
-        <w:rPr>
-          <w:rFonts w:ascii="Consolas" w:eastAsia="Consolas" w:hAnsi="Consolas" w:cs="Consolas"/>
-          <w:sz w:val="17"/>
-          <w:szCs w:val="17"/>
-        </w:rPr>
-        <w:t>context.output</w:t>
-      </w:r>
-      <w:proofErr w:type="gramEnd"/>
-      <w:r>
-        <w:rPr>
-          <w:rFonts w:ascii="Consolas" w:eastAsia="Consolas" w:hAnsi="Consolas" w:cs="Consolas"/>
-          <w:sz w:val="17"/>
-          <w:szCs w:val="17"/>
-        </w:rPr>
-        <w:t>}'</w:t>
+        <w:t xml:space="preserve">    expected = context.text.strip()</w:t>
+      </w:r>
+    </w:p>
+    <w:p>
+      <w:pPr>
+        <w:shd w:val="clear" w:color="auto" w:fill="F2F2F2"/>
+        <w:ind w:left="240" w:right="240"/>
+      </w:pPr>
+      <w:r>
+        <w:rPr>
+          <w:rFonts w:ascii="Consolas" w:eastAsia="Consolas" w:hAnsi="Consolas" w:cs="Consolas"/>
+          <w:sz w:val="17"/>
+          <w:szCs w:val="17"/>
+        </w:rPr>
+        <w:t xml:space="preserve">    assert expected in context.output, \</w:t>
+      </w:r>
+    </w:p>
+    <w:p>
+      <w:pPr>
+        <w:shd w:val="clear" w:color="auto" w:fill="F2F2F2"/>
+        <w:ind w:left="240" w:right="240"/>
+      </w:pPr>
+      <w:r>
+        <w:rPr>
+          <w:rFonts w:ascii="Consolas" w:eastAsia="Consolas" w:hAnsi="Consolas" w:cs="Consolas"/>
+          <w:sz w:val="17"/>
+          <w:szCs w:val="17"/>
+        </w:rPr>
+        <w:t xml:space="preserve">        f'Expected to find:\n{expected}\nbut got:\n{context.output}'</w:t>
       </w:r>
     </w:p>
     <w:p>
@@ -3903,161 +3108,35 @@
           <w:sz w:val="17"/>
           <w:szCs w:val="17"/>
         </w:rPr>
-        <w:t>@</w:t>
-      </w:r>
-      <w:proofErr w:type="gramStart"/>
-      <w:r>
-        <w:rPr>
-          <w:rFonts w:ascii="Consolas" w:eastAsia="Consolas" w:hAnsi="Consolas" w:cs="Consolas"/>
-          <w:sz w:val="17"/>
-          <w:szCs w:val="17"/>
-        </w:rPr>
-        <w:t>when(</w:t>
-      </w:r>
-      <w:proofErr w:type="gramEnd"/>
-      <w:r>
-        <w:rPr>
-          <w:rFonts w:ascii="Consolas" w:eastAsia="Consolas" w:hAnsi="Consolas" w:cs="Consolas"/>
-          <w:sz w:val="17"/>
-          <w:szCs w:val="17"/>
-        </w:rPr>
-        <w:t xml:space="preserve">'the user updates </w:t>
-      </w:r>
-      <w:proofErr w:type="gramStart"/>
-      <w:r>
-        <w:rPr>
-          <w:rFonts w:ascii="Consolas" w:eastAsia="Consolas" w:hAnsi="Consolas" w:cs="Consolas"/>
-          <w:sz w:val="17"/>
-          <w:szCs w:val="17"/>
-        </w:rPr>
-        <w:t>product "{product}"</w:t>
-      </w:r>
-      <w:proofErr w:type="gramEnd"/>
-      <w:r>
-        <w:rPr>
-          <w:rFonts w:ascii="Consolas" w:eastAsia="Consolas" w:hAnsi="Consolas" w:cs="Consolas"/>
-          <w:sz w:val="17"/>
-          <w:szCs w:val="17"/>
-        </w:rPr>
-        <w:t xml:space="preserve"> to </w:t>
-      </w:r>
-      <w:proofErr w:type="gramStart"/>
-      <w:r>
-        <w:rPr>
-          <w:rFonts w:ascii="Consolas" w:eastAsia="Consolas" w:hAnsi="Consolas" w:cs="Consolas"/>
-          <w:sz w:val="17"/>
-          <w:szCs w:val="17"/>
-        </w:rPr>
-        <w:t>quantity "{quantity}"</w:t>
-      </w:r>
-      <w:proofErr w:type="gramEnd"/>
-      <w:r>
-        <w:rPr>
-          <w:rFonts w:ascii="Consolas" w:eastAsia="Consolas" w:hAnsi="Consolas" w:cs="Consolas"/>
-          <w:sz w:val="17"/>
-          <w:szCs w:val="17"/>
-        </w:rPr>
-        <w:t>')</w:t>
-      </w:r>
-    </w:p>
-    <w:p>
-      <w:pPr>
-        <w:shd w:val="clear" w:color="auto" w:fill="F2F2F2"/>
-        <w:ind w:left="240" w:right="240"/>
-      </w:pPr>
-      <w:r>
-        <w:rPr>
-          <w:rFonts w:ascii="Consolas" w:eastAsia="Consolas" w:hAnsi="Consolas" w:cs="Consolas"/>
-          <w:sz w:val="17"/>
-          <w:szCs w:val="17"/>
-        </w:rPr>
-        <w:t>def step_</w:t>
-      </w:r>
-      <w:proofErr w:type="gramStart"/>
-      <w:r>
-        <w:rPr>
-          <w:rFonts w:ascii="Consolas" w:eastAsia="Consolas" w:hAnsi="Consolas" w:cs="Consolas"/>
-          <w:sz w:val="17"/>
-          <w:szCs w:val="17"/>
-        </w:rPr>
-        <w:t>impl(</w:t>
-      </w:r>
-      <w:proofErr w:type="gramEnd"/>
-      <w:r>
-        <w:rPr>
-          <w:rFonts w:ascii="Consolas" w:eastAsia="Consolas" w:hAnsi="Consolas" w:cs="Consolas"/>
-          <w:sz w:val="17"/>
-          <w:szCs w:val="17"/>
-        </w:rPr>
-        <w:t>context, product, quantity):</w:t>
-      </w:r>
-    </w:p>
-    <w:p>
-      <w:pPr>
-        <w:shd w:val="clear" w:color="auto" w:fill="F2F2F2"/>
-        <w:ind w:left="240" w:right="240"/>
-      </w:pPr>
-      <w:r>
-        <w:rPr>
-          <w:rFonts w:ascii="Consolas" w:eastAsia="Consolas" w:hAnsi="Consolas" w:cs="Consolas"/>
-          <w:sz w:val="17"/>
-          <w:szCs w:val="17"/>
-        </w:rPr>
-        <w:t xml:space="preserve">    </w:t>
-      </w:r>
-      <w:proofErr w:type="gramStart"/>
-      <w:r>
-        <w:rPr>
-          <w:rFonts w:ascii="Consolas" w:eastAsia="Consolas" w:hAnsi="Consolas" w:cs="Consolas"/>
-          <w:sz w:val="17"/>
-          <w:szCs w:val="17"/>
-        </w:rPr>
-        <w:t>context.output</w:t>
-      </w:r>
-      <w:proofErr w:type="gramEnd"/>
-      <w:r>
-        <w:rPr>
-          <w:rFonts w:ascii="Consolas" w:eastAsia="Consolas" w:hAnsi="Consolas" w:cs="Consolas"/>
-          <w:sz w:val="17"/>
-          <w:szCs w:val="17"/>
-        </w:rPr>
-        <w:t xml:space="preserve"> = </w:t>
-      </w:r>
-      <w:proofErr w:type="gramStart"/>
-      <w:r>
-        <w:rPr>
-          <w:rFonts w:ascii="Consolas" w:eastAsia="Consolas" w:hAnsi="Consolas" w:cs="Consolas"/>
-          <w:sz w:val="17"/>
-          <w:szCs w:val="17"/>
-        </w:rPr>
-        <w:t>context.inventory</w:t>
-      </w:r>
-      <w:proofErr w:type="gramEnd"/>
-      <w:r>
-        <w:rPr>
-          <w:rFonts w:ascii="Consolas" w:eastAsia="Consolas" w:hAnsi="Consolas" w:cs="Consolas"/>
-          <w:sz w:val="17"/>
-          <w:szCs w:val="17"/>
-        </w:rPr>
-        <w:t>.update_</w:t>
-      </w:r>
-      <w:proofErr w:type="gramStart"/>
-      <w:r>
-        <w:rPr>
-          <w:rFonts w:ascii="Consolas" w:eastAsia="Consolas" w:hAnsi="Consolas" w:cs="Consolas"/>
-          <w:sz w:val="17"/>
-          <w:szCs w:val="17"/>
-        </w:rPr>
-        <w:t>quantity(</w:t>
-      </w:r>
-      <w:proofErr w:type="gramEnd"/>
-      <w:r>
-        <w:rPr>
-          <w:rFonts w:ascii="Consolas" w:eastAsia="Consolas" w:hAnsi="Consolas" w:cs="Consolas"/>
-          <w:sz w:val="17"/>
-          <w:szCs w:val="17"/>
-        </w:rPr>
-        <w:t>product, int(quantity))</w:t>
+        <w:t>@when('the user updates product "{product}" to quantity "{quantity}"')</w:t>
+      </w:r>
+    </w:p>
+    <w:p>
+      <w:pPr>
+        <w:shd w:val="clear" w:color="auto" w:fill="F2F2F2"/>
+        <w:ind w:left="240" w:right="240"/>
+      </w:pPr>
+      <w:r>
+        <w:rPr>
+          <w:rFonts w:ascii="Consolas" w:eastAsia="Consolas" w:hAnsi="Consolas" w:cs="Consolas"/>
+          <w:sz w:val="17"/>
+          <w:szCs w:val="17"/>
+        </w:rPr>
+        <w:t>def step_impl(context, product, quantity):</w:t>
+      </w:r>
+    </w:p>
+    <w:p>
+      <w:pPr>
+        <w:shd w:val="clear" w:color="auto" w:fill="F2F2F2"/>
+        <w:ind w:left="240" w:right="240"/>
+      </w:pPr>
+      <w:r>
+        <w:rPr>
+          <w:rFonts w:ascii="Consolas" w:eastAsia="Consolas" w:hAnsi="Consolas" w:cs="Consolas"/>
+          <w:sz w:val="17"/>
+          <w:szCs w:val="17"/>
+        </w:rPr>
+        <w:t xml:space="preserve">    context.output = context.inventory.update_quantity(product, int(quantity))</w:t>
       </w:r>
     </w:p>
     <w:p>
@@ -4085,93 +3164,21 @@
           <w:sz w:val="17"/>
           <w:szCs w:val="17"/>
         </w:rPr>
-        <w:t>@</w:t>
-      </w:r>
-      <w:proofErr w:type="gramStart"/>
-      <w:r>
-        <w:rPr>
-          <w:rFonts w:ascii="Consolas" w:eastAsia="Consolas" w:hAnsi="Consolas" w:cs="Consolas"/>
-          <w:sz w:val="17"/>
-          <w:szCs w:val="17"/>
-        </w:rPr>
-        <w:t>then(</w:t>
-      </w:r>
-      <w:proofErr w:type="gramEnd"/>
-      <w:r>
-        <w:rPr>
-          <w:rFonts w:ascii="Consolas" w:eastAsia="Consolas" w:hAnsi="Consolas" w:cs="Consolas"/>
-          <w:sz w:val="17"/>
-          <w:szCs w:val="17"/>
-        </w:rPr>
-        <w:t xml:space="preserve">'the inventory should show </w:t>
-      </w:r>
-      <w:proofErr w:type="gramStart"/>
-      <w:r>
-        <w:rPr>
-          <w:rFonts w:ascii="Consolas" w:eastAsia="Consolas" w:hAnsi="Consolas" w:cs="Consolas"/>
-          <w:sz w:val="17"/>
-          <w:szCs w:val="17"/>
-        </w:rPr>
-        <w:t>product "{product}"</w:t>
-      </w:r>
-      <w:proofErr w:type="gramEnd"/>
-      <w:r>
-        <w:rPr>
-          <w:rFonts w:ascii="Consolas" w:eastAsia="Consolas" w:hAnsi="Consolas" w:cs="Consolas"/>
-          <w:sz w:val="17"/>
-          <w:szCs w:val="17"/>
-        </w:rPr>
-        <w:t xml:space="preserve"> with </w:t>
-      </w:r>
-      <w:proofErr w:type="gramStart"/>
-      <w:r>
-        <w:rPr>
-          <w:rFonts w:ascii="Consolas" w:eastAsia="Consolas" w:hAnsi="Consolas" w:cs="Consolas"/>
-          <w:sz w:val="17"/>
-          <w:szCs w:val="17"/>
-        </w:rPr>
-        <w:t>quantity "{quantity}"</w:t>
-      </w:r>
-      <w:proofErr w:type="gramEnd"/>
-      <w:r>
-        <w:rPr>
-          <w:rFonts w:ascii="Consolas" w:eastAsia="Consolas" w:hAnsi="Consolas" w:cs="Consolas"/>
-          <w:sz w:val="17"/>
-          <w:szCs w:val="17"/>
-        </w:rPr>
-        <w:t>')</w:t>
-      </w:r>
-    </w:p>
-    <w:p>
-      <w:pPr>
-        <w:shd w:val="clear" w:color="auto" w:fill="F2F2F2"/>
-        <w:ind w:left="240" w:right="240"/>
-      </w:pPr>
-      <w:r>
-        <w:rPr>
-          <w:rFonts w:ascii="Consolas" w:eastAsia="Consolas" w:hAnsi="Consolas" w:cs="Consolas"/>
-          <w:sz w:val="17"/>
-          <w:szCs w:val="17"/>
-        </w:rPr>
-        <w:t>def step_</w:t>
-      </w:r>
-      <w:proofErr w:type="gramStart"/>
-      <w:r>
-        <w:rPr>
-          <w:rFonts w:ascii="Consolas" w:eastAsia="Consolas" w:hAnsi="Consolas" w:cs="Consolas"/>
-          <w:sz w:val="17"/>
-          <w:szCs w:val="17"/>
-        </w:rPr>
-        <w:t>impl(</w:t>
-      </w:r>
-      <w:proofErr w:type="gramEnd"/>
-      <w:r>
-        <w:rPr>
-          <w:rFonts w:ascii="Consolas" w:eastAsia="Consolas" w:hAnsi="Consolas" w:cs="Consolas"/>
-          <w:sz w:val="17"/>
-          <w:szCs w:val="17"/>
-        </w:rPr>
-        <w:t>context, product, quantity):</w:t>
+        <w:t>@then('the inventory should show product "{product}" with quantity "{quantity}"')</w:t>
+      </w:r>
+    </w:p>
+    <w:p>
+      <w:pPr>
+        <w:shd w:val="clear" w:color="auto" w:fill="F2F2F2"/>
+        <w:ind w:left="240" w:right="240"/>
+      </w:pPr>
+      <w:r>
+        <w:rPr>
+          <w:rFonts w:ascii="Consolas" w:eastAsia="Consolas" w:hAnsi="Consolas" w:cs="Consolas"/>
+          <w:sz w:val="17"/>
+          <w:szCs w:val="17"/>
+        </w:rPr>
+        <w:t>def step_impl(context, product, quantity):</w:t>
       </w:r>
     </w:p>
     <w:p>
@@ -4199,89 +3206,35 @@
           <w:sz w:val="17"/>
           <w:szCs w:val="17"/>
         </w:rPr>
-        <w:t xml:space="preserve">    assert product_obj is not None, </w:t>
-      </w:r>
-      <w:proofErr w:type="gramStart"/>
-      <w:r>
-        <w:rPr>
-          <w:rFonts w:ascii="Consolas" w:eastAsia="Consolas" w:hAnsi="Consolas" w:cs="Consolas"/>
-          <w:sz w:val="17"/>
-          <w:szCs w:val="17"/>
-        </w:rPr>
-        <w:t>f'Product "{product}"</w:t>
-      </w:r>
-      <w:proofErr w:type="gramEnd"/>
-      <w:r>
-        <w:rPr>
-          <w:rFonts w:ascii="Consolas" w:eastAsia="Consolas" w:hAnsi="Consolas" w:cs="Consolas"/>
-          <w:sz w:val="17"/>
-          <w:szCs w:val="17"/>
-        </w:rPr>
-        <w:t xml:space="preserve"> not found'</w:t>
-      </w:r>
-    </w:p>
-    <w:p>
-      <w:pPr>
-        <w:shd w:val="clear" w:color="auto" w:fill="F2F2F2"/>
-        <w:ind w:left="240" w:right="240"/>
-      </w:pPr>
-      <w:r>
-        <w:rPr>
-          <w:rFonts w:ascii="Consolas" w:eastAsia="Consolas" w:hAnsi="Consolas" w:cs="Consolas"/>
-          <w:sz w:val="17"/>
-          <w:szCs w:val="17"/>
-        </w:rPr>
-        <w:t xml:space="preserve">    assert product_</w:t>
-      </w:r>
-      <w:proofErr w:type="gramStart"/>
-      <w:r>
-        <w:rPr>
-          <w:rFonts w:ascii="Consolas" w:eastAsia="Consolas" w:hAnsi="Consolas" w:cs="Consolas"/>
-          <w:sz w:val="17"/>
-          <w:szCs w:val="17"/>
-        </w:rPr>
-        <w:t>obj.quantity</w:t>
-      </w:r>
-      <w:proofErr w:type="gramEnd"/>
-      <w:r>
-        <w:rPr>
-          <w:rFonts w:ascii="Consolas" w:eastAsia="Consolas" w:hAnsi="Consolas" w:cs="Consolas"/>
-          <w:sz w:val="17"/>
-          <w:szCs w:val="17"/>
-        </w:rPr>
-        <w:t xml:space="preserve"> == int(quantity), \</w:t>
-      </w:r>
-    </w:p>
-    <w:p>
-      <w:pPr>
-        <w:shd w:val="clear" w:color="auto" w:fill="F2F2F2"/>
-        <w:ind w:left="240" w:right="240"/>
-      </w:pPr>
-      <w:r>
-        <w:rPr>
-          <w:rFonts w:ascii="Consolas" w:eastAsia="Consolas" w:hAnsi="Consolas" w:cs="Consolas"/>
-          <w:sz w:val="17"/>
-          <w:szCs w:val="17"/>
-        </w:rPr>
-        <w:t xml:space="preserve">        f'Expected quantity {quantity} but got {product_</w:t>
-      </w:r>
-      <w:proofErr w:type="gramStart"/>
-      <w:r>
-        <w:rPr>
-          <w:rFonts w:ascii="Consolas" w:eastAsia="Consolas" w:hAnsi="Consolas" w:cs="Consolas"/>
-          <w:sz w:val="17"/>
-          <w:szCs w:val="17"/>
-        </w:rPr>
-        <w:t>obj.quantity</w:t>
-      </w:r>
-      <w:proofErr w:type="gramEnd"/>
-      <w:r>
-        <w:rPr>
-          <w:rFonts w:ascii="Consolas" w:eastAsia="Consolas" w:hAnsi="Consolas" w:cs="Consolas"/>
-          <w:sz w:val="17"/>
-          <w:szCs w:val="17"/>
-        </w:rPr>
-        <w:t>}'</w:t>
+        <w:t xml:space="preserve">    assert product_obj is not None, f'Product "{product}" not found'</w:t>
+      </w:r>
+    </w:p>
+    <w:p>
+      <w:pPr>
+        <w:shd w:val="clear" w:color="auto" w:fill="F2F2F2"/>
+        <w:ind w:left="240" w:right="240"/>
+      </w:pPr>
+      <w:r>
+        <w:rPr>
+          <w:rFonts w:ascii="Consolas" w:eastAsia="Consolas" w:hAnsi="Consolas" w:cs="Consolas"/>
+          <w:sz w:val="17"/>
+          <w:szCs w:val="17"/>
+        </w:rPr>
+        <w:t xml:space="preserve">    assert product_obj.quantity == int(quantity), \</w:t>
+      </w:r>
+    </w:p>
+    <w:p>
+      <w:pPr>
+        <w:shd w:val="clear" w:color="auto" w:fill="F2F2F2"/>
+        <w:ind w:left="240" w:right="240"/>
+      </w:pPr>
+      <w:r>
+        <w:rPr>
+          <w:rFonts w:ascii="Consolas" w:eastAsia="Consolas" w:hAnsi="Consolas" w:cs="Consolas"/>
+          <w:sz w:val="17"/>
+          <w:szCs w:val="17"/>
+        </w:rPr>
+        <w:t xml:space="preserve">        f'Expected quantity {quantity} but got {product_obj.quantity}'</w:t>
       </w:r>
     </w:p>
     <w:p>
@@ -4315,125 +3268,35 @@
           <w:sz w:val="17"/>
           <w:szCs w:val="17"/>
         </w:rPr>
-        <w:t>@</w:t>
-      </w:r>
-      <w:proofErr w:type="gramStart"/>
-      <w:r>
-        <w:rPr>
-          <w:rFonts w:ascii="Consolas" w:eastAsia="Consolas" w:hAnsi="Consolas" w:cs="Consolas"/>
-          <w:sz w:val="17"/>
-          <w:szCs w:val="17"/>
-        </w:rPr>
-        <w:t>when(</w:t>
-      </w:r>
-      <w:proofErr w:type="gramEnd"/>
-      <w:r>
-        <w:rPr>
-          <w:rFonts w:ascii="Consolas" w:eastAsia="Consolas" w:hAnsi="Consolas" w:cs="Consolas"/>
-          <w:sz w:val="17"/>
-          <w:szCs w:val="17"/>
-        </w:rPr>
-        <w:t xml:space="preserve">'the user removes the </w:t>
-      </w:r>
-      <w:proofErr w:type="gramStart"/>
-      <w:r>
-        <w:rPr>
-          <w:rFonts w:ascii="Consolas" w:eastAsia="Consolas" w:hAnsi="Consolas" w:cs="Consolas"/>
-          <w:sz w:val="17"/>
-          <w:szCs w:val="17"/>
-        </w:rPr>
-        <w:t>product "{product}"</w:t>
-      </w:r>
-      <w:proofErr w:type="gramEnd"/>
-      <w:r>
-        <w:rPr>
-          <w:rFonts w:ascii="Consolas" w:eastAsia="Consolas" w:hAnsi="Consolas" w:cs="Consolas"/>
-          <w:sz w:val="17"/>
-          <w:szCs w:val="17"/>
-        </w:rPr>
-        <w:t>')</w:t>
-      </w:r>
-    </w:p>
-    <w:p>
-      <w:pPr>
-        <w:shd w:val="clear" w:color="auto" w:fill="F2F2F2"/>
-        <w:ind w:left="240" w:right="240"/>
-      </w:pPr>
-      <w:r>
-        <w:rPr>
-          <w:rFonts w:ascii="Consolas" w:eastAsia="Consolas" w:hAnsi="Consolas" w:cs="Consolas"/>
-          <w:sz w:val="17"/>
-          <w:szCs w:val="17"/>
-        </w:rPr>
-        <w:t>def step_</w:t>
-      </w:r>
-      <w:proofErr w:type="gramStart"/>
-      <w:r>
-        <w:rPr>
-          <w:rFonts w:ascii="Consolas" w:eastAsia="Consolas" w:hAnsi="Consolas" w:cs="Consolas"/>
-          <w:sz w:val="17"/>
-          <w:szCs w:val="17"/>
-        </w:rPr>
-        <w:t>impl(</w:t>
-      </w:r>
-      <w:proofErr w:type="gramEnd"/>
-      <w:r>
-        <w:rPr>
-          <w:rFonts w:ascii="Consolas" w:eastAsia="Consolas" w:hAnsi="Consolas" w:cs="Consolas"/>
-          <w:sz w:val="17"/>
-          <w:szCs w:val="17"/>
-        </w:rPr>
-        <w:t>context, product):</w:t>
-      </w:r>
-    </w:p>
-    <w:p>
-      <w:pPr>
-        <w:shd w:val="clear" w:color="auto" w:fill="F2F2F2"/>
-        <w:ind w:left="240" w:right="240"/>
-      </w:pPr>
-      <w:r>
-        <w:rPr>
-          <w:rFonts w:ascii="Consolas" w:eastAsia="Consolas" w:hAnsi="Consolas" w:cs="Consolas"/>
-          <w:sz w:val="17"/>
-          <w:szCs w:val="17"/>
-        </w:rPr>
-        <w:t xml:space="preserve">    </w:t>
-      </w:r>
-      <w:proofErr w:type="gramStart"/>
-      <w:r>
-        <w:rPr>
-          <w:rFonts w:ascii="Consolas" w:eastAsia="Consolas" w:hAnsi="Consolas" w:cs="Consolas"/>
-          <w:sz w:val="17"/>
-          <w:szCs w:val="17"/>
-        </w:rPr>
-        <w:t>context.output</w:t>
-      </w:r>
-      <w:proofErr w:type="gramEnd"/>
-      <w:r>
-        <w:rPr>
-          <w:rFonts w:ascii="Consolas" w:eastAsia="Consolas" w:hAnsi="Consolas" w:cs="Consolas"/>
-          <w:sz w:val="17"/>
-          <w:szCs w:val="17"/>
-        </w:rPr>
-        <w:t xml:space="preserve"> = </w:t>
-      </w:r>
-      <w:proofErr w:type="gramStart"/>
-      <w:r>
-        <w:rPr>
-          <w:rFonts w:ascii="Consolas" w:eastAsia="Consolas" w:hAnsi="Consolas" w:cs="Consolas"/>
-          <w:sz w:val="17"/>
-          <w:szCs w:val="17"/>
-        </w:rPr>
-        <w:t>context.inventory</w:t>
-      </w:r>
-      <w:proofErr w:type="gramEnd"/>
-      <w:r>
-        <w:rPr>
-          <w:rFonts w:ascii="Consolas" w:eastAsia="Consolas" w:hAnsi="Consolas" w:cs="Consolas"/>
-          <w:sz w:val="17"/>
-          <w:szCs w:val="17"/>
-        </w:rPr>
-        <w:t>.remove_product(product)</w:t>
+        <w:t>@when('the user removes the product "{product}"')</w:t>
+      </w:r>
+    </w:p>
+    <w:p>
+      <w:pPr>
+        <w:shd w:val="clear" w:color="auto" w:fill="F2F2F2"/>
+        <w:ind w:left="240" w:right="240"/>
+      </w:pPr>
+      <w:r>
+        <w:rPr>
+          <w:rFonts w:ascii="Consolas" w:eastAsia="Consolas" w:hAnsi="Consolas" w:cs="Consolas"/>
+          <w:sz w:val="17"/>
+          <w:szCs w:val="17"/>
+        </w:rPr>
+        <w:t>def step_impl(context, product):</w:t>
+      </w:r>
+    </w:p>
+    <w:p>
+      <w:pPr>
+        <w:shd w:val="clear" w:color="auto" w:fill="F2F2F2"/>
+        <w:ind w:left="240" w:right="240"/>
+      </w:pPr>
+      <w:r>
+        <w:rPr>
+          <w:rFonts w:ascii="Consolas" w:eastAsia="Consolas" w:hAnsi="Consolas" w:cs="Consolas"/>
+          <w:sz w:val="17"/>
+          <w:szCs w:val="17"/>
+        </w:rPr>
+        <w:t xml:space="preserve">    context.output = context.inventory.remove_product(product)</w:t>
       </w:r>
     </w:p>
     <w:p>
@@ -4461,139 +3324,49 @@
           <w:sz w:val="17"/>
           <w:szCs w:val="17"/>
         </w:rPr>
-        <w:t>@</w:t>
-      </w:r>
-      <w:proofErr w:type="gramStart"/>
-      <w:r>
-        <w:rPr>
-          <w:rFonts w:ascii="Consolas" w:eastAsia="Consolas" w:hAnsi="Consolas" w:cs="Consolas"/>
-          <w:sz w:val="17"/>
-          <w:szCs w:val="17"/>
-        </w:rPr>
-        <w:t>then(</w:t>
-      </w:r>
-      <w:proofErr w:type="gramEnd"/>
-      <w:r>
-        <w:rPr>
-          <w:rFonts w:ascii="Consolas" w:eastAsia="Consolas" w:hAnsi="Consolas" w:cs="Consolas"/>
-          <w:sz w:val="17"/>
-          <w:szCs w:val="17"/>
-        </w:rPr>
-        <w:t xml:space="preserve">'the inventory should not </w:t>
-      </w:r>
-      <w:proofErr w:type="gramStart"/>
-      <w:r>
-        <w:rPr>
-          <w:rFonts w:ascii="Consolas" w:eastAsia="Consolas" w:hAnsi="Consolas" w:cs="Consolas"/>
-          <w:sz w:val="17"/>
-          <w:szCs w:val="17"/>
-        </w:rPr>
-        <w:t>contain "{product}"</w:t>
-      </w:r>
-      <w:proofErr w:type="gramEnd"/>
-      <w:r>
-        <w:rPr>
-          <w:rFonts w:ascii="Consolas" w:eastAsia="Consolas" w:hAnsi="Consolas" w:cs="Consolas"/>
-          <w:sz w:val="17"/>
-          <w:szCs w:val="17"/>
-        </w:rPr>
-        <w:t>')</w:t>
-      </w:r>
-    </w:p>
-    <w:p>
-      <w:pPr>
-        <w:shd w:val="clear" w:color="auto" w:fill="F2F2F2"/>
-        <w:ind w:left="240" w:right="240"/>
-      </w:pPr>
-      <w:r>
-        <w:rPr>
-          <w:rFonts w:ascii="Consolas" w:eastAsia="Consolas" w:hAnsi="Consolas" w:cs="Consolas"/>
-          <w:sz w:val="17"/>
-          <w:szCs w:val="17"/>
-        </w:rPr>
-        <w:t>def step_</w:t>
-      </w:r>
-      <w:proofErr w:type="gramStart"/>
-      <w:r>
-        <w:rPr>
-          <w:rFonts w:ascii="Consolas" w:eastAsia="Consolas" w:hAnsi="Consolas" w:cs="Consolas"/>
-          <w:sz w:val="17"/>
-          <w:szCs w:val="17"/>
-        </w:rPr>
-        <w:t>impl(</w:t>
-      </w:r>
-      <w:proofErr w:type="gramEnd"/>
-      <w:r>
-        <w:rPr>
-          <w:rFonts w:ascii="Consolas" w:eastAsia="Consolas" w:hAnsi="Consolas" w:cs="Consolas"/>
-          <w:sz w:val="17"/>
-          <w:szCs w:val="17"/>
-        </w:rPr>
-        <w:t>context, product):</w:t>
-      </w:r>
-    </w:p>
-    <w:p>
-      <w:pPr>
-        <w:shd w:val="clear" w:color="auto" w:fill="F2F2F2"/>
-        <w:ind w:left="240" w:right="240"/>
-      </w:pPr>
-      <w:r>
-        <w:rPr>
-          <w:rFonts w:ascii="Consolas" w:eastAsia="Consolas" w:hAnsi="Consolas" w:cs="Consolas"/>
-          <w:sz w:val="17"/>
-          <w:szCs w:val="17"/>
-        </w:rPr>
-        <w:t xml:space="preserve">    assert not </w:t>
-      </w:r>
-      <w:proofErr w:type="gramStart"/>
-      <w:r>
-        <w:rPr>
-          <w:rFonts w:ascii="Consolas" w:eastAsia="Consolas" w:hAnsi="Consolas" w:cs="Consolas"/>
-          <w:sz w:val="17"/>
-          <w:szCs w:val="17"/>
-        </w:rPr>
-        <w:t>context.inventory</w:t>
-      </w:r>
-      <w:proofErr w:type="gramEnd"/>
-      <w:r>
-        <w:rPr>
-          <w:rFonts w:ascii="Consolas" w:eastAsia="Consolas" w:hAnsi="Consolas" w:cs="Consolas"/>
-          <w:sz w:val="17"/>
-          <w:szCs w:val="17"/>
-        </w:rPr>
-        <w:t>.contains(product), \</w:t>
-      </w:r>
-    </w:p>
-    <w:p>
-      <w:pPr>
-        <w:shd w:val="clear" w:color="auto" w:fill="F2F2F2"/>
-        <w:ind w:left="240" w:right="240"/>
-      </w:pPr>
-      <w:r>
-        <w:rPr>
-          <w:rFonts w:ascii="Consolas" w:eastAsia="Consolas" w:hAnsi="Consolas" w:cs="Consolas"/>
-          <w:sz w:val="17"/>
-          <w:szCs w:val="17"/>
-        </w:rPr>
-        <w:t xml:space="preserve">        </w:t>
-      </w:r>
-      <w:proofErr w:type="gramStart"/>
-      <w:r>
-        <w:rPr>
-          <w:rFonts w:ascii="Consolas" w:eastAsia="Consolas" w:hAnsi="Consolas" w:cs="Consolas"/>
-          <w:sz w:val="17"/>
-          <w:szCs w:val="17"/>
-        </w:rPr>
-        <w:t>f'Product "{product}"</w:t>
-      </w:r>
-      <w:proofErr w:type="gramEnd"/>
-      <w:r>
-        <w:rPr>
-          <w:rFonts w:ascii="Consolas" w:eastAsia="Consolas" w:hAnsi="Consolas" w:cs="Consolas"/>
-          <w:sz w:val="17"/>
-          <w:szCs w:val="17"/>
-        </w:rPr>
-        <w:t xml:space="preserve"> is still in the inventory'</w:t>
+        <w:t>@then('the inventory should not contain "{product}"')</w:t>
+      </w:r>
+    </w:p>
+    <w:p>
+      <w:pPr>
+        <w:shd w:val="clear" w:color="auto" w:fill="F2F2F2"/>
+        <w:ind w:left="240" w:right="240"/>
+      </w:pPr>
+      <w:r>
+        <w:rPr>
+          <w:rFonts w:ascii="Consolas" w:eastAsia="Consolas" w:hAnsi="Consolas" w:cs="Consolas"/>
+          <w:sz w:val="17"/>
+          <w:szCs w:val="17"/>
+        </w:rPr>
+        <w:t>def step_impl(context, product):</w:t>
+      </w:r>
+    </w:p>
+    <w:p>
+      <w:pPr>
+        <w:shd w:val="clear" w:color="auto" w:fill="F2F2F2"/>
+        <w:ind w:left="240" w:right="240"/>
+      </w:pPr>
+      <w:r>
+        <w:rPr>
+          <w:rFonts w:ascii="Consolas" w:eastAsia="Consolas" w:hAnsi="Consolas" w:cs="Consolas"/>
+          <w:sz w:val="17"/>
+          <w:szCs w:val="17"/>
+        </w:rPr>
+        <w:t xml:space="preserve">    assert not context.inventory.contains(product), \</w:t>
+      </w:r>
+    </w:p>
+    <w:p>
+      <w:pPr>
+        <w:shd w:val="clear" w:color="auto" w:fill="F2F2F2"/>
+        <w:ind w:left="240" w:right="240"/>
+      </w:pPr>
+      <w:r>
+        <w:rPr>
+          <w:rFonts w:ascii="Consolas" w:eastAsia="Consolas" w:hAnsi="Consolas" w:cs="Consolas"/>
+          <w:sz w:val="17"/>
+          <w:szCs w:val="17"/>
+        </w:rPr>
+        <w:t xml:space="preserve">        f'Product "{product}" is still in the inventory'</w:t>
       </w:r>
     </w:p>
     <w:p>
@@ -4627,125 +3400,35 @@
           <w:sz w:val="17"/>
           <w:szCs w:val="17"/>
         </w:rPr>
-        <w:t>@</w:t>
-      </w:r>
-      <w:proofErr w:type="gramStart"/>
-      <w:r>
-        <w:rPr>
-          <w:rFonts w:ascii="Consolas" w:eastAsia="Consolas" w:hAnsi="Consolas" w:cs="Consolas"/>
-          <w:sz w:val="17"/>
-          <w:szCs w:val="17"/>
-        </w:rPr>
-        <w:t>when(</w:t>
-      </w:r>
-      <w:proofErr w:type="gramEnd"/>
-      <w:r>
-        <w:rPr>
-          <w:rFonts w:ascii="Consolas" w:eastAsia="Consolas" w:hAnsi="Consolas" w:cs="Consolas"/>
-          <w:sz w:val="17"/>
-          <w:szCs w:val="17"/>
-        </w:rPr>
-        <w:t xml:space="preserve">'the user searches for the </w:t>
-      </w:r>
-      <w:proofErr w:type="gramStart"/>
-      <w:r>
-        <w:rPr>
-          <w:rFonts w:ascii="Consolas" w:eastAsia="Consolas" w:hAnsi="Consolas" w:cs="Consolas"/>
-          <w:sz w:val="17"/>
-          <w:szCs w:val="17"/>
-        </w:rPr>
-        <w:t>product "{product}"</w:t>
-      </w:r>
-      <w:proofErr w:type="gramEnd"/>
-      <w:r>
-        <w:rPr>
-          <w:rFonts w:ascii="Consolas" w:eastAsia="Consolas" w:hAnsi="Consolas" w:cs="Consolas"/>
-          <w:sz w:val="17"/>
-          <w:szCs w:val="17"/>
-        </w:rPr>
-        <w:t>')</w:t>
-      </w:r>
-    </w:p>
-    <w:p>
-      <w:pPr>
-        <w:shd w:val="clear" w:color="auto" w:fill="F2F2F2"/>
-        <w:ind w:left="240" w:right="240"/>
-      </w:pPr>
-      <w:r>
-        <w:rPr>
-          <w:rFonts w:ascii="Consolas" w:eastAsia="Consolas" w:hAnsi="Consolas" w:cs="Consolas"/>
-          <w:sz w:val="17"/>
-          <w:szCs w:val="17"/>
-        </w:rPr>
-        <w:t>def step_</w:t>
-      </w:r>
-      <w:proofErr w:type="gramStart"/>
-      <w:r>
-        <w:rPr>
-          <w:rFonts w:ascii="Consolas" w:eastAsia="Consolas" w:hAnsi="Consolas" w:cs="Consolas"/>
-          <w:sz w:val="17"/>
-          <w:szCs w:val="17"/>
-        </w:rPr>
-        <w:t>impl(</w:t>
-      </w:r>
-      <w:proofErr w:type="gramEnd"/>
-      <w:r>
-        <w:rPr>
-          <w:rFonts w:ascii="Consolas" w:eastAsia="Consolas" w:hAnsi="Consolas" w:cs="Consolas"/>
-          <w:sz w:val="17"/>
-          <w:szCs w:val="17"/>
-        </w:rPr>
-        <w:t>context, product):</w:t>
-      </w:r>
-    </w:p>
-    <w:p>
-      <w:pPr>
-        <w:shd w:val="clear" w:color="auto" w:fill="F2F2F2"/>
-        <w:ind w:left="240" w:right="240"/>
-      </w:pPr>
-      <w:r>
-        <w:rPr>
-          <w:rFonts w:ascii="Consolas" w:eastAsia="Consolas" w:hAnsi="Consolas" w:cs="Consolas"/>
-          <w:sz w:val="17"/>
-          <w:szCs w:val="17"/>
-        </w:rPr>
-        <w:t xml:space="preserve">    </w:t>
-      </w:r>
-      <w:proofErr w:type="gramStart"/>
-      <w:r>
-        <w:rPr>
-          <w:rFonts w:ascii="Consolas" w:eastAsia="Consolas" w:hAnsi="Consolas" w:cs="Consolas"/>
-          <w:sz w:val="17"/>
-          <w:szCs w:val="17"/>
-        </w:rPr>
-        <w:t>context.output</w:t>
-      </w:r>
-      <w:proofErr w:type="gramEnd"/>
-      <w:r>
-        <w:rPr>
-          <w:rFonts w:ascii="Consolas" w:eastAsia="Consolas" w:hAnsi="Consolas" w:cs="Consolas"/>
-          <w:sz w:val="17"/>
-          <w:szCs w:val="17"/>
-        </w:rPr>
-        <w:t xml:space="preserve"> = </w:t>
-      </w:r>
-      <w:proofErr w:type="gramStart"/>
-      <w:r>
-        <w:rPr>
-          <w:rFonts w:ascii="Consolas" w:eastAsia="Consolas" w:hAnsi="Consolas" w:cs="Consolas"/>
-          <w:sz w:val="17"/>
-          <w:szCs w:val="17"/>
-        </w:rPr>
-        <w:t>context.inventory</w:t>
-      </w:r>
-      <w:proofErr w:type="gramEnd"/>
-      <w:r>
-        <w:rPr>
-          <w:rFonts w:ascii="Consolas" w:eastAsia="Consolas" w:hAnsi="Consolas" w:cs="Consolas"/>
-          <w:sz w:val="17"/>
-          <w:szCs w:val="17"/>
-        </w:rPr>
-        <w:t>.search_product(product)</w:t>
+        <w:t>@when('the user searches for the product "{product}"')</w:t>
+      </w:r>
+    </w:p>
+    <w:p>
+      <w:pPr>
+        <w:shd w:val="clear" w:color="auto" w:fill="F2F2F2"/>
+        <w:ind w:left="240" w:right="240"/>
+      </w:pPr>
+      <w:r>
+        <w:rPr>
+          <w:rFonts w:ascii="Consolas" w:eastAsia="Consolas" w:hAnsi="Consolas" w:cs="Consolas"/>
+          <w:sz w:val="17"/>
+          <w:szCs w:val="17"/>
+        </w:rPr>
+        <w:t>def step_impl(context, product):</w:t>
+      </w:r>
+    </w:p>
+    <w:p>
+      <w:pPr>
+        <w:shd w:val="clear" w:color="auto" w:fill="F2F2F2"/>
+        <w:ind w:left="240" w:right="240"/>
+      </w:pPr>
+      <w:r>
+        <w:rPr>
+          <w:rFonts w:ascii="Consolas" w:eastAsia="Consolas" w:hAnsi="Consolas" w:cs="Consolas"/>
+          <w:sz w:val="17"/>
+          <w:szCs w:val="17"/>
+        </w:rPr>
+        <w:t xml:space="preserve">    context.output = context.inventory.search_product(product)</w:t>
       </w:r>
     </w:p>
     <w:p>
@@ -4773,157 +3456,49 @@
           <w:sz w:val="17"/>
           <w:szCs w:val="17"/>
         </w:rPr>
-        <w:t>@</w:t>
-      </w:r>
-      <w:proofErr w:type="gramStart"/>
-      <w:r>
-        <w:rPr>
-          <w:rFonts w:ascii="Consolas" w:eastAsia="Consolas" w:hAnsi="Consolas" w:cs="Consolas"/>
-          <w:sz w:val="17"/>
-          <w:szCs w:val="17"/>
-        </w:rPr>
-        <w:t>then(</w:t>
-      </w:r>
-      <w:proofErr w:type="gramEnd"/>
-      <w:r>
-        <w:rPr>
-          <w:rFonts w:ascii="Consolas" w:eastAsia="Consolas" w:hAnsi="Consolas" w:cs="Consolas"/>
-          <w:sz w:val="17"/>
-          <w:szCs w:val="17"/>
-        </w:rPr>
-        <w:t xml:space="preserve">'the output should </w:t>
-      </w:r>
-      <w:proofErr w:type="gramStart"/>
-      <w:r>
-        <w:rPr>
-          <w:rFonts w:ascii="Consolas" w:eastAsia="Consolas" w:hAnsi="Consolas" w:cs="Consolas"/>
-          <w:sz w:val="17"/>
-          <w:szCs w:val="17"/>
-        </w:rPr>
-        <w:t>be "{message}"</w:t>
-      </w:r>
-      <w:proofErr w:type="gramEnd"/>
-      <w:r>
-        <w:rPr>
-          <w:rFonts w:ascii="Consolas" w:eastAsia="Consolas" w:hAnsi="Consolas" w:cs="Consolas"/>
-          <w:sz w:val="17"/>
-          <w:szCs w:val="17"/>
-        </w:rPr>
-        <w:t>')</w:t>
-      </w:r>
-    </w:p>
-    <w:p>
-      <w:pPr>
-        <w:shd w:val="clear" w:color="auto" w:fill="F2F2F2"/>
-        <w:ind w:left="240" w:right="240"/>
-      </w:pPr>
-      <w:r>
-        <w:rPr>
-          <w:rFonts w:ascii="Consolas" w:eastAsia="Consolas" w:hAnsi="Consolas" w:cs="Consolas"/>
-          <w:sz w:val="17"/>
-          <w:szCs w:val="17"/>
-        </w:rPr>
-        <w:t>def step_</w:t>
-      </w:r>
-      <w:proofErr w:type="gramStart"/>
-      <w:r>
-        <w:rPr>
-          <w:rFonts w:ascii="Consolas" w:eastAsia="Consolas" w:hAnsi="Consolas" w:cs="Consolas"/>
-          <w:sz w:val="17"/>
-          <w:szCs w:val="17"/>
-        </w:rPr>
-        <w:t>impl(</w:t>
-      </w:r>
-      <w:proofErr w:type="gramEnd"/>
-      <w:r>
-        <w:rPr>
-          <w:rFonts w:ascii="Consolas" w:eastAsia="Consolas" w:hAnsi="Consolas" w:cs="Consolas"/>
-          <w:sz w:val="17"/>
-          <w:szCs w:val="17"/>
-        </w:rPr>
-        <w:t>context, message):</w:t>
-      </w:r>
-    </w:p>
-    <w:p>
-      <w:pPr>
-        <w:shd w:val="clear" w:color="auto" w:fill="F2F2F2"/>
-        <w:ind w:left="240" w:right="240"/>
-      </w:pPr>
-      <w:r>
-        <w:rPr>
-          <w:rFonts w:ascii="Consolas" w:eastAsia="Consolas" w:hAnsi="Consolas" w:cs="Consolas"/>
-          <w:sz w:val="17"/>
-          <w:szCs w:val="17"/>
-        </w:rPr>
-        <w:t xml:space="preserve">    assert </w:t>
-      </w:r>
-      <w:proofErr w:type="gramStart"/>
-      <w:r>
-        <w:rPr>
-          <w:rFonts w:ascii="Consolas" w:eastAsia="Consolas" w:hAnsi="Consolas" w:cs="Consolas"/>
-          <w:sz w:val="17"/>
-          <w:szCs w:val="17"/>
-        </w:rPr>
-        <w:t>context.output</w:t>
-      </w:r>
-      <w:proofErr w:type="gramEnd"/>
-      <w:r>
-        <w:rPr>
-          <w:rFonts w:ascii="Consolas" w:eastAsia="Consolas" w:hAnsi="Consolas" w:cs="Consolas"/>
-          <w:sz w:val="17"/>
-          <w:szCs w:val="17"/>
-        </w:rPr>
-        <w:t xml:space="preserve"> == message, \</w:t>
-      </w:r>
-    </w:p>
-    <w:p>
-      <w:pPr>
-        <w:shd w:val="clear" w:color="auto" w:fill="F2F2F2"/>
-        <w:ind w:left="240" w:right="240"/>
-      </w:pPr>
-      <w:r>
-        <w:rPr>
-          <w:rFonts w:ascii="Consolas" w:eastAsia="Consolas" w:hAnsi="Consolas" w:cs="Consolas"/>
-          <w:sz w:val="17"/>
-          <w:szCs w:val="17"/>
-        </w:rPr>
-        <w:t xml:space="preserve">        </w:t>
-      </w:r>
-      <w:proofErr w:type="gramStart"/>
-      <w:r>
-        <w:rPr>
-          <w:rFonts w:ascii="Consolas" w:eastAsia="Consolas" w:hAnsi="Consolas" w:cs="Consolas"/>
-          <w:sz w:val="17"/>
-          <w:szCs w:val="17"/>
-        </w:rPr>
-        <w:t>f'Expected "{message}"</w:t>
-      </w:r>
-      <w:proofErr w:type="gramEnd"/>
-      <w:r>
-        <w:rPr>
-          <w:rFonts w:ascii="Consolas" w:eastAsia="Consolas" w:hAnsi="Consolas" w:cs="Consolas"/>
-          <w:sz w:val="17"/>
-          <w:szCs w:val="17"/>
-        </w:rPr>
-        <w:t xml:space="preserve"> but </w:t>
-      </w:r>
-      <w:proofErr w:type="gramStart"/>
-      <w:r>
-        <w:rPr>
-          <w:rFonts w:ascii="Consolas" w:eastAsia="Consolas" w:hAnsi="Consolas" w:cs="Consolas"/>
-          <w:sz w:val="17"/>
-          <w:szCs w:val="17"/>
-        </w:rPr>
-        <w:t>got "{context.output</w:t>
-      </w:r>
-      <w:proofErr w:type="gramEnd"/>
-      <w:r>
-        <w:rPr>
-          <w:rFonts w:ascii="Consolas" w:eastAsia="Consolas" w:hAnsi="Consolas" w:cs="Consolas"/>
-          <w:sz w:val="17"/>
-          <w:szCs w:val="17"/>
-        </w:rPr>
-        <w:t>}"'</w:t>
+        <w:t>@then('the output should be "{message}"')</w:t>
+      </w:r>
+    </w:p>
+    <w:p>
+      <w:pPr>
+        <w:shd w:val="clear" w:color="auto" w:fill="F2F2F2"/>
+        <w:ind w:left="240" w:right="240"/>
+      </w:pPr>
+      <w:r>
+        <w:rPr>
+          <w:rFonts w:ascii="Consolas" w:eastAsia="Consolas" w:hAnsi="Consolas" w:cs="Consolas"/>
+          <w:sz w:val="17"/>
+          <w:szCs w:val="17"/>
+        </w:rPr>
+        <w:t>def step_impl(context, message):</w:t>
+      </w:r>
+    </w:p>
+    <w:p>
+      <w:pPr>
+        <w:shd w:val="clear" w:color="auto" w:fill="F2F2F2"/>
+        <w:ind w:left="240" w:right="240"/>
+      </w:pPr>
+      <w:r>
+        <w:rPr>
+          <w:rFonts w:ascii="Consolas" w:eastAsia="Consolas" w:hAnsi="Consolas" w:cs="Consolas"/>
+          <w:sz w:val="17"/>
+          <w:szCs w:val="17"/>
+        </w:rPr>
+        <w:t xml:space="preserve">    assert context.output == message, \</w:t>
+      </w:r>
+    </w:p>
+    <w:p>
+      <w:pPr>
+        <w:shd w:val="clear" w:color="auto" w:fill="F2F2F2"/>
+        <w:ind w:left="240" w:right="240"/>
+      </w:pPr>
+      <w:r>
+        <w:rPr>
+          <w:rFonts w:ascii="Consolas" w:eastAsia="Consolas" w:hAnsi="Consolas" w:cs="Consolas"/>
+          <w:sz w:val="17"/>
+          <w:szCs w:val="17"/>
+        </w:rPr>
+        <w:t xml:space="preserve">        f'Expected "{message}" but got "{context.output}"'</w:t>
       </w:r>
     </w:p>
     <w:p>
@@ -4989,25 +3564,7 @@
           <w:sz w:val="17"/>
           <w:szCs w:val="17"/>
         </w:rPr>
-        <w:t xml:space="preserve">    def __init_</w:t>
-      </w:r>
-      <w:proofErr w:type="gramStart"/>
-      <w:r>
-        <w:rPr>
-          <w:rFonts w:ascii="Consolas" w:eastAsia="Consolas" w:hAnsi="Consolas" w:cs="Consolas"/>
-          <w:sz w:val="17"/>
-          <w:szCs w:val="17"/>
-        </w:rPr>
-        <w:t>_(</w:t>
-      </w:r>
-      <w:proofErr w:type="gramEnd"/>
-      <w:r>
-        <w:rPr>
-          <w:rFonts w:ascii="Consolas" w:eastAsia="Consolas" w:hAnsi="Consolas" w:cs="Consolas"/>
-          <w:sz w:val="17"/>
-          <w:szCs w:val="17"/>
-        </w:rPr>
-        <w:t>self, name, category="General", quantity=0, price=0.0):</w:t>
+        <w:t xml:space="preserve">    def __init__(self, name, category="General", quantity=0, price=0.0):</w:t>
       </w:r>
     </w:p>
     <w:p>
@@ -5035,89 +3592,35 @@
           <w:sz w:val="17"/>
           <w:szCs w:val="17"/>
         </w:rPr>
-        <w:t xml:space="preserve">        </w:t>
-      </w:r>
-      <w:proofErr w:type="gramStart"/>
-      <w:r>
-        <w:rPr>
-          <w:rFonts w:ascii="Consolas" w:eastAsia="Consolas" w:hAnsi="Consolas" w:cs="Consolas"/>
-          <w:sz w:val="17"/>
-          <w:szCs w:val="17"/>
-        </w:rPr>
-        <w:t>self.category</w:t>
-      </w:r>
-      <w:proofErr w:type="gramEnd"/>
-      <w:r>
-        <w:rPr>
-          <w:rFonts w:ascii="Consolas" w:eastAsia="Consolas" w:hAnsi="Consolas" w:cs="Consolas"/>
-          <w:sz w:val="17"/>
-          <w:szCs w:val="17"/>
-        </w:rPr>
-        <w:t xml:space="preserve"> = category</w:t>
-      </w:r>
-    </w:p>
-    <w:p>
-      <w:pPr>
-        <w:shd w:val="clear" w:color="auto" w:fill="F2F2F2"/>
-        <w:ind w:left="240" w:right="240"/>
-      </w:pPr>
-      <w:r>
-        <w:rPr>
-          <w:rFonts w:ascii="Consolas" w:eastAsia="Consolas" w:hAnsi="Consolas" w:cs="Consolas"/>
-          <w:sz w:val="17"/>
-          <w:szCs w:val="17"/>
-        </w:rPr>
-        <w:t xml:space="preserve">        </w:t>
-      </w:r>
-      <w:proofErr w:type="gramStart"/>
-      <w:r>
-        <w:rPr>
-          <w:rFonts w:ascii="Consolas" w:eastAsia="Consolas" w:hAnsi="Consolas" w:cs="Consolas"/>
-          <w:sz w:val="17"/>
-          <w:szCs w:val="17"/>
-        </w:rPr>
-        <w:t>self.quantity</w:t>
-      </w:r>
-      <w:proofErr w:type="gramEnd"/>
-      <w:r>
-        <w:rPr>
-          <w:rFonts w:ascii="Consolas" w:eastAsia="Consolas" w:hAnsi="Consolas" w:cs="Consolas"/>
-          <w:sz w:val="17"/>
-          <w:szCs w:val="17"/>
-        </w:rPr>
-        <w:t xml:space="preserve"> = int(quantity)</w:t>
-      </w:r>
-    </w:p>
-    <w:p>
-      <w:pPr>
-        <w:shd w:val="clear" w:color="auto" w:fill="F2F2F2"/>
-        <w:ind w:left="240" w:right="240"/>
-      </w:pPr>
-      <w:r>
-        <w:rPr>
-          <w:rFonts w:ascii="Consolas" w:eastAsia="Consolas" w:hAnsi="Consolas" w:cs="Consolas"/>
-          <w:sz w:val="17"/>
-          <w:szCs w:val="17"/>
-        </w:rPr>
-        <w:t xml:space="preserve">        </w:t>
-      </w:r>
-      <w:proofErr w:type="gramStart"/>
-      <w:r>
-        <w:rPr>
-          <w:rFonts w:ascii="Consolas" w:eastAsia="Consolas" w:hAnsi="Consolas" w:cs="Consolas"/>
-          <w:sz w:val="17"/>
-          <w:szCs w:val="17"/>
-        </w:rPr>
-        <w:t>self.price</w:t>
-      </w:r>
-      <w:proofErr w:type="gramEnd"/>
-      <w:r>
-        <w:rPr>
-          <w:rFonts w:ascii="Consolas" w:eastAsia="Consolas" w:hAnsi="Consolas" w:cs="Consolas"/>
-          <w:sz w:val="17"/>
-          <w:szCs w:val="17"/>
-        </w:rPr>
-        <w:t xml:space="preserve"> = float(price)</w:t>
+        <w:t xml:space="preserve">        self.category = category</w:t>
+      </w:r>
+    </w:p>
+    <w:p>
+      <w:pPr>
+        <w:shd w:val="clear" w:color="auto" w:fill="F2F2F2"/>
+        <w:ind w:left="240" w:right="240"/>
+      </w:pPr>
+      <w:r>
+        <w:rPr>
+          <w:rFonts w:ascii="Consolas" w:eastAsia="Consolas" w:hAnsi="Consolas" w:cs="Consolas"/>
+          <w:sz w:val="17"/>
+          <w:szCs w:val="17"/>
+        </w:rPr>
+        <w:t xml:space="preserve">        self.quantity = int(quantity)</w:t>
+      </w:r>
+    </w:p>
+    <w:p>
+      <w:pPr>
+        <w:shd w:val="clear" w:color="auto" w:fill="F2F2F2"/>
+        <w:ind w:left="240" w:right="240"/>
+      </w:pPr>
+      <w:r>
+        <w:rPr>
+          <w:rFonts w:ascii="Consolas" w:eastAsia="Consolas" w:hAnsi="Consolas" w:cs="Consolas"/>
+          <w:sz w:val="17"/>
+          <w:szCs w:val="17"/>
+        </w:rPr>
+        <w:t xml:space="preserve">        self.price = float(price)</w:t>
       </w:r>
     </w:p>
     <w:p>
@@ -5173,25 +3676,7 @@
           <w:sz w:val="17"/>
           <w:szCs w:val="17"/>
         </w:rPr>
-        <w:t xml:space="preserve">        </w:t>
-      </w:r>
-      <w:proofErr w:type="gramStart"/>
-      <w:r>
-        <w:rPr>
-          <w:rFonts w:ascii="Consolas" w:eastAsia="Consolas" w:hAnsi="Consolas" w:cs="Consolas"/>
-          <w:sz w:val="17"/>
-          <w:szCs w:val="17"/>
-        </w:rPr>
-        <w:t>self._</w:t>
-      </w:r>
-      <w:proofErr w:type="gramEnd"/>
-      <w:r>
-        <w:rPr>
-          <w:rFonts w:ascii="Consolas" w:eastAsia="Consolas" w:hAnsi="Consolas" w:cs="Consolas"/>
-          <w:sz w:val="17"/>
-          <w:szCs w:val="17"/>
-        </w:rPr>
-        <w:t>products = {}</w:t>
+        <w:t xml:space="preserve">        self._products = {}</w:t>
       </w:r>
     </w:p>
     <w:p>
@@ -5219,57 +3704,21 @@
           <w:sz w:val="17"/>
           <w:szCs w:val="17"/>
         </w:rPr>
-        <w:t xml:space="preserve">    def </w:t>
-      </w:r>
-      <w:proofErr w:type="gramStart"/>
-      <w:r>
-        <w:rPr>
-          <w:rFonts w:ascii="Consolas" w:eastAsia="Consolas" w:hAnsi="Consolas" w:cs="Consolas"/>
-          <w:sz w:val="17"/>
-          <w:szCs w:val="17"/>
-        </w:rPr>
-        <w:t>contains(</w:t>
-      </w:r>
-      <w:proofErr w:type="gramEnd"/>
-      <w:r>
-        <w:rPr>
-          <w:rFonts w:ascii="Consolas" w:eastAsia="Consolas" w:hAnsi="Consolas" w:cs="Consolas"/>
-          <w:sz w:val="17"/>
-          <w:szCs w:val="17"/>
-        </w:rPr>
-        <w:t>self, name):</w:t>
-      </w:r>
-    </w:p>
-    <w:p>
-      <w:pPr>
-        <w:shd w:val="clear" w:color="auto" w:fill="F2F2F2"/>
-        <w:ind w:left="240" w:right="240"/>
-      </w:pPr>
-      <w:r>
-        <w:rPr>
-          <w:rFonts w:ascii="Consolas" w:eastAsia="Consolas" w:hAnsi="Consolas" w:cs="Consolas"/>
-          <w:sz w:val="17"/>
-          <w:szCs w:val="17"/>
-        </w:rPr>
-        <w:t xml:space="preserve">        return name in </w:t>
-      </w:r>
-      <w:proofErr w:type="gramStart"/>
-      <w:r>
-        <w:rPr>
-          <w:rFonts w:ascii="Consolas" w:eastAsia="Consolas" w:hAnsi="Consolas" w:cs="Consolas"/>
-          <w:sz w:val="17"/>
-          <w:szCs w:val="17"/>
-        </w:rPr>
-        <w:t>self._</w:t>
-      </w:r>
-      <w:proofErr w:type="gramEnd"/>
-      <w:r>
-        <w:rPr>
-          <w:rFonts w:ascii="Consolas" w:eastAsia="Consolas" w:hAnsi="Consolas" w:cs="Consolas"/>
-          <w:sz w:val="17"/>
-          <w:szCs w:val="17"/>
-        </w:rPr>
-        <w:t>products</w:t>
+        <w:t xml:space="preserve">    def contains(self, name):</w:t>
+      </w:r>
+    </w:p>
+    <w:p>
+      <w:pPr>
+        <w:shd w:val="clear" w:color="auto" w:fill="F2F2F2"/>
+        <w:ind w:left="240" w:right="240"/>
+      </w:pPr>
+      <w:r>
+        <w:rPr>
+          <w:rFonts w:ascii="Consolas" w:eastAsia="Consolas" w:hAnsi="Consolas" w:cs="Consolas"/>
+          <w:sz w:val="17"/>
+          <w:szCs w:val="17"/>
+        </w:rPr>
+        <w:t xml:space="preserve">        return name in self._products</w:t>
       </w:r>
     </w:p>
     <w:p>
@@ -5297,25 +3746,7 @@
           <w:sz w:val="17"/>
           <w:szCs w:val="17"/>
         </w:rPr>
-        <w:t xml:space="preserve">    def get_</w:t>
-      </w:r>
-      <w:proofErr w:type="gramStart"/>
-      <w:r>
-        <w:rPr>
-          <w:rFonts w:ascii="Consolas" w:eastAsia="Consolas" w:hAnsi="Consolas" w:cs="Consolas"/>
-          <w:sz w:val="17"/>
-          <w:szCs w:val="17"/>
-        </w:rPr>
-        <w:t>product(</w:t>
-      </w:r>
-      <w:proofErr w:type="gramEnd"/>
-      <w:r>
-        <w:rPr>
-          <w:rFonts w:ascii="Consolas" w:eastAsia="Consolas" w:hAnsi="Consolas" w:cs="Consolas"/>
-          <w:sz w:val="17"/>
-          <w:szCs w:val="17"/>
-        </w:rPr>
-        <w:t>self, name):</w:t>
+        <w:t xml:space="preserve">    def get_product(self, name):</w:t>
       </w:r>
     </w:p>
     <w:p>
@@ -5357,57 +3788,21 @@
           <w:sz w:val="17"/>
           <w:szCs w:val="17"/>
         </w:rPr>
-        <w:t xml:space="preserve">    def add_</w:t>
-      </w:r>
-      <w:proofErr w:type="gramStart"/>
-      <w:r>
-        <w:rPr>
-          <w:rFonts w:ascii="Consolas" w:eastAsia="Consolas" w:hAnsi="Consolas" w:cs="Consolas"/>
-          <w:sz w:val="17"/>
-          <w:szCs w:val="17"/>
-        </w:rPr>
-        <w:t>product(</w:t>
-      </w:r>
-      <w:proofErr w:type="gramEnd"/>
-      <w:r>
-        <w:rPr>
-          <w:rFonts w:ascii="Consolas" w:eastAsia="Consolas" w:hAnsi="Consolas" w:cs="Consolas"/>
-          <w:sz w:val="17"/>
-          <w:szCs w:val="17"/>
-        </w:rPr>
-        <w:t>self, name, category="General", quantity=0, price=0.0):</w:t>
-      </w:r>
-    </w:p>
-    <w:p>
-      <w:pPr>
-        <w:shd w:val="clear" w:color="auto" w:fill="F2F2F2"/>
-        <w:ind w:left="240" w:right="240"/>
-      </w:pPr>
-      <w:r>
-        <w:rPr>
-          <w:rFonts w:ascii="Consolas" w:eastAsia="Consolas" w:hAnsi="Consolas" w:cs="Consolas"/>
-          <w:sz w:val="17"/>
-          <w:szCs w:val="17"/>
-        </w:rPr>
-        <w:t xml:space="preserve">        if name in </w:t>
-      </w:r>
-      <w:proofErr w:type="gramStart"/>
-      <w:r>
-        <w:rPr>
-          <w:rFonts w:ascii="Consolas" w:eastAsia="Consolas" w:hAnsi="Consolas" w:cs="Consolas"/>
-          <w:sz w:val="17"/>
-          <w:szCs w:val="17"/>
-        </w:rPr>
-        <w:t>self._</w:t>
-      </w:r>
-      <w:proofErr w:type="gramEnd"/>
-      <w:r>
-        <w:rPr>
-          <w:rFonts w:ascii="Consolas" w:eastAsia="Consolas" w:hAnsi="Consolas" w:cs="Consolas"/>
-          <w:sz w:val="17"/>
-          <w:szCs w:val="17"/>
-        </w:rPr>
-        <w:t>products:</w:t>
+        <w:t xml:space="preserve">    def add_product(self, name, category="General", quantity=0, price=0.0):</w:t>
+      </w:r>
+    </w:p>
+    <w:p>
+      <w:pPr>
+        <w:shd w:val="clear" w:color="auto" w:fill="F2F2F2"/>
+        <w:ind w:left="240" w:right="240"/>
+      </w:pPr>
+      <w:r>
+        <w:rPr>
+          <w:rFonts w:ascii="Consolas" w:eastAsia="Consolas" w:hAnsi="Consolas" w:cs="Consolas"/>
+          <w:sz w:val="17"/>
+          <w:szCs w:val="17"/>
+        </w:rPr>
+        <w:t xml:space="preserve">        if name in self._products:</w:t>
       </w:r>
     </w:p>
     <w:p>
@@ -5435,43 +3830,7 @@
           <w:sz w:val="17"/>
           <w:szCs w:val="17"/>
         </w:rPr>
-        <w:t xml:space="preserve">        </w:t>
-      </w:r>
-      <w:proofErr w:type="gramStart"/>
-      <w:r>
-        <w:rPr>
-          <w:rFonts w:ascii="Consolas" w:eastAsia="Consolas" w:hAnsi="Consolas" w:cs="Consolas"/>
-          <w:sz w:val="17"/>
-          <w:szCs w:val="17"/>
-        </w:rPr>
-        <w:t>self._</w:t>
-      </w:r>
-      <w:proofErr w:type="gramEnd"/>
-      <w:r>
-        <w:rPr>
-          <w:rFonts w:ascii="Consolas" w:eastAsia="Consolas" w:hAnsi="Consolas" w:cs="Consolas"/>
-          <w:sz w:val="17"/>
-          <w:szCs w:val="17"/>
-        </w:rPr>
-        <w:t xml:space="preserve">products[name] = </w:t>
-      </w:r>
-      <w:proofErr w:type="gramStart"/>
-      <w:r>
-        <w:rPr>
-          <w:rFonts w:ascii="Consolas" w:eastAsia="Consolas" w:hAnsi="Consolas" w:cs="Consolas"/>
-          <w:sz w:val="17"/>
-          <w:szCs w:val="17"/>
-        </w:rPr>
-        <w:t>Product(</w:t>
-      </w:r>
-      <w:proofErr w:type="gramEnd"/>
-      <w:r>
-        <w:rPr>
-          <w:rFonts w:ascii="Consolas" w:eastAsia="Consolas" w:hAnsi="Consolas" w:cs="Consolas"/>
-          <w:sz w:val="17"/>
-          <w:szCs w:val="17"/>
-        </w:rPr>
-        <w:t>name, category, quantity, price)</w:t>
+        <w:t xml:space="preserve">        self._products[name] = Product(name, category, quantity, price)</w:t>
       </w:r>
     </w:p>
     <w:p>
@@ -5527,139 +3886,49 @@
           <w:sz w:val="17"/>
           <w:szCs w:val="17"/>
         </w:rPr>
-        <w:t xml:space="preserve">        if not </w:t>
-      </w:r>
-      <w:proofErr w:type="gramStart"/>
-      <w:r>
-        <w:rPr>
-          <w:rFonts w:ascii="Consolas" w:eastAsia="Consolas" w:hAnsi="Consolas" w:cs="Consolas"/>
-          <w:sz w:val="17"/>
-          <w:szCs w:val="17"/>
-        </w:rPr>
-        <w:t>self._</w:t>
-      </w:r>
-      <w:proofErr w:type="gramEnd"/>
-      <w:r>
-        <w:rPr>
-          <w:rFonts w:ascii="Consolas" w:eastAsia="Consolas" w:hAnsi="Consolas" w:cs="Consolas"/>
-          <w:sz w:val="17"/>
-          <w:szCs w:val="17"/>
-        </w:rPr>
-        <w:t>products:</w:t>
-      </w:r>
-    </w:p>
-    <w:p>
-      <w:pPr>
-        <w:shd w:val="clear" w:color="auto" w:fill="F2F2F2"/>
-        <w:ind w:left="240" w:right="240"/>
-      </w:pPr>
-      <w:r>
-        <w:rPr>
-          <w:rFonts w:ascii="Consolas" w:eastAsia="Consolas" w:hAnsi="Consolas" w:cs="Consolas"/>
-          <w:sz w:val="17"/>
-          <w:szCs w:val="17"/>
-        </w:rPr>
-        <w:t xml:space="preserve">            return "</w:t>
-      </w:r>
-      <w:proofErr w:type="gramStart"/>
-      <w:r>
-        <w:rPr>
-          <w:rFonts w:ascii="Consolas" w:eastAsia="Consolas" w:hAnsi="Consolas" w:cs="Consolas"/>
-          <w:sz w:val="17"/>
-          <w:szCs w:val="17"/>
-        </w:rPr>
-        <w:t>Products:\n(</w:t>
-      </w:r>
-      <w:proofErr w:type="gramEnd"/>
-      <w:r>
-        <w:rPr>
-          <w:rFonts w:ascii="Consolas" w:eastAsia="Consolas" w:hAnsi="Consolas" w:cs="Consolas"/>
-          <w:sz w:val="17"/>
-          <w:szCs w:val="17"/>
-        </w:rPr>
-        <w:t>no products)"</w:t>
-      </w:r>
-    </w:p>
-    <w:p>
-      <w:pPr>
-        <w:shd w:val="clear" w:color="auto" w:fill="F2F2F2"/>
-        <w:ind w:left="240" w:right="240"/>
-      </w:pPr>
-      <w:r>
-        <w:rPr>
-          <w:rFonts w:ascii="Consolas" w:eastAsia="Consolas" w:hAnsi="Consolas" w:cs="Consolas"/>
-          <w:sz w:val="17"/>
-          <w:szCs w:val="17"/>
-        </w:rPr>
-        <w:t xml:space="preserve">        lines = ["Products:"] + [f</w:t>
-      </w:r>
-      <w:proofErr w:type="gramStart"/>
-      <w:r>
-        <w:rPr>
-          <w:rFonts w:ascii="Consolas" w:eastAsia="Consolas" w:hAnsi="Consolas" w:cs="Consolas"/>
-          <w:sz w:val="17"/>
-          <w:szCs w:val="17"/>
-        </w:rPr>
-        <w:t>"- {n}"</w:t>
-      </w:r>
-      <w:proofErr w:type="gramEnd"/>
-      <w:r>
-        <w:rPr>
-          <w:rFonts w:ascii="Consolas" w:eastAsia="Consolas" w:hAnsi="Consolas" w:cs="Consolas"/>
-          <w:sz w:val="17"/>
-          <w:szCs w:val="17"/>
-        </w:rPr>
-        <w:t xml:space="preserve"> for n in </w:t>
-      </w:r>
-      <w:proofErr w:type="gramStart"/>
-      <w:r>
-        <w:rPr>
-          <w:rFonts w:ascii="Consolas" w:eastAsia="Consolas" w:hAnsi="Consolas" w:cs="Consolas"/>
-          <w:sz w:val="17"/>
-          <w:szCs w:val="17"/>
-        </w:rPr>
-        <w:t>self._</w:t>
-      </w:r>
-      <w:proofErr w:type="gramEnd"/>
-      <w:r>
-        <w:rPr>
-          <w:rFonts w:ascii="Consolas" w:eastAsia="Consolas" w:hAnsi="Consolas" w:cs="Consolas"/>
-          <w:sz w:val="17"/>
-          <w:szCs w:val="17"/>
-        </w:rPr>
-        <w:t>products]</w:t>
-      </w:r>
-    </w:p>
-    <w:p>
-      <w:pPr>
-        <w:shd w:val="clear" w:color="auto" w:fill="F2F2F2"/>
-        <w:ind w:left="240" w:right="240"/>
-      </w:pPr>
-      <w:r>
-        <w:rPr>
-          <w:rFonts w:ascii="Consolas" w:eastAsia="Consolas" w:hAnsi="Consolas" w:cs="Consolas"/>
-          <w:sz w:val="17"/>
-          <w:szCs w:val="17"/>
-        </w:rPr>
-        <w:t xml:space="preserve">        return "\n</w:t>
-      </w:r>
-      <w:proofErr w:type="gramStart"/>
-      <w:r>
-        <w:rPr>
-          <w:rFonts w:ascii="Consolas" w:eastAsia="Consolas" w:hAnsi="Consolas" w:cs="Consolas"/>
-          <w:sz w:val="17"/>
-          <w:szCs w:val="17"/>
-        </w:rPr>
-        <w:t>".join</w:t>
-      </w:r>
-      <w:proofErr w:type="gramEnd"/>
-      <w:r>
-        <w:rPr>
-          <w:rFonts w:ascii="Consolas" w:eastAsia="Consolas" w:hAnsi="Consolas" w:cs="Consolas"/>
-          <w:sz w:val="17"/>
-          <w:szCs w:val="17"/>
-        </w:rPr>
-        <w:t>(lines)</w:t>
+        <w:t xml:space="preserve">        if not self._products:</w:t>
+      </w:r>
+    </w:p>
+    <w:p>
+      <w:pPr>
+        <w:shd w:val="clear" w:color="auto" w:fill="F2F2F2"/>
+        <w:ind w:left="240" w:right="240"/>
+      </w:pPr>
+      <w:r>
+        <w:rPr>
+          <w:rFonts w:ascii="Consolas" w:eastAsia="Consolas" w:hAnsi="Consolas" w:cs="Consolas"/>
+          <w:sz w:val="17"/>
+          <w:szCs w:val="17"/>
+        </w:rPr>
+        <w:t xml:space="preserve">            return "Products:\n(no products)"</w:t>
+      </w:r>
+    </w:p>
+    <w:p>
+      <w:pPr>
+        <w:shd w:val="clear" w:color="auto" w:fill="F2F2F2"/>
+        <w:ind w:left="240" w:right="240"/>
+      </w:pPr>
+      <w:r>
+        <w:rPr>
+          <w:rFonts w:ascii="Consolas" w:eastAsia="Consolas" w:hAnsi="Consolas" w:cs="Consolas"/>
+          <w:sz w:val="17"/>
+          <w:szCs w:val="17"/>
+        </w:rPr>
+        <w:t xml:space="preserve">        lines = ["Products:"] + [f"- {n}" for n in self._products]</w:t>
+      </w:r>
+    </w:p>
+    <w:p>
+      <w:pPr>
+        <w:shd w:val="clear" w:color="auto" w:fill="F2F2F2"/>
+        <w:ind w:left="240" w:right="240"/>
+      </w:pPr>
+      <w:r>
+        <w:rPr>
+          <w:rFonts w:ascii="Consolas" w:eastAsia="Consolas" w:hAnsi="Consolas" w:cs="Consolas"/>
+          <w:sz w:val="17"/>
+          <w:szCs w:val="17"/>
+        </w:rPr>
+        <w:t xml:space="preserve">        return "\n".join(lines)</w:t>
       </w:r>
     </w:p>
     <w:p>
@@ -5687,57 +3956,21 @@
           <w:sz w:val="17"/>
           <w:szCs w:val="17"/>
         </w:rPr>
-        <w:t xml:space="preserve">    def update_</w:t>
-      </w:r>
-      <w:proofErr w:type="gramStart"/>
-      <w:r>
-        <w:rPr>
-          <w:rFonts w:ascii="Consolas" w:eastAsia="Consolas" w:hAnsi="Consolas" w:cs="Consolas"/>
-          <w:sz w:val="17"/>
-          <w:szCs w:val="17"/>
-        </w:rPr>
-        <w:t>quantity(</w:t>
-      </w:r>
-      <w:proofErr w:type="gramEnd"/>
-      <w:r>
-        <w:rPr>
-          <w:rFonts w:ascii="Consolas" w:eastAsia="Consolas" w:hAnsi="Consolas" w:cs="Consolas"/>
-          <w:sz w:val="17"/>
-          <w:szCs w:val="17"/>
-        </w:rPr>
-        <w:t>self, name, quantity):</w:t>
-      </w:r>
-    </w:p>
-    <w:p>
-      <w:pPr>
-        <w:shd w:val="clear" w:color="auto" w:fill="F2F2F2"/>
-        <w:ind w:left="240" w:right="240"/>
-      </w:pPr>
-      <w:r>
-        <w:rPr>
-          <w:rFonts w:ascii="Consolas" w:eastAsia="Consolas" w:hAnsi="Consolas" w:cs="Consolas"/>
-          <w:sz w:val="17"/>
-          <w:szCs w:val="17"/>
-        </w:rPr>
-        <w:t xml:space="preserve">        if name not in </w:t>
-      </w:r>
-      <w:proofErr w:type="gramStart"/>
-      <w:r>
-        <w:rPr>
-          <w:rFonts w:ascii="Consolas" w:eastAsia="Consolas" w:hAnsi="Consolas" w:cs="Consolas"/>
-          <w:sz w:val="17"/>
-          <w:szCs w:val="17"/>
-        </w:rPr>
-        <w:t>self._</w:t>
-      </w:r>
-      <w:proofErr w:type="gramEnd"/>
-      <w:r>
-        <w:rPr>
-          <w:rFonts w:ascii="Consolas" w:eastAsia="Consolas" w:hAnsi="Consolas" w:cs="Consolas"/>
-          <w:sz w:val="17"/>
-          <w:szCs w:val="17"/>
-        </w:rPr>
-        <w:t>products:</w:t>
+        <w:t xml:space="preserve">    def update_quantity(self, name, quantity):</w:t>
+      </w:r>
+    </w:p>
+    <w:p>
+      <w:pPr>
+        <w:shd w:val="clear" w:color="auto" w:fill="F2F2F2"/>
+        <w:ind w:left="240" w:right="240"/>
+      </w:pPr>
+      <w:r>
+        <w:rPr>
+          <w:rFonts w:ascii="Consolas" w:eastAsia="Consolas" w:hAnsi="Consolas" w:cs="Consolas"/>
+          <w:sz w:val="17"/>
+          <w:szCs w:val="17"/>
+        </w:rPr>
+        <w:t xml:space="preserve">        if name not in self._products:</w:t>
       </w:r>
     </w:p>
     <w:p>
@@ -5765,43 +3998,7 @@
           <w:sz w:val="17"/>
           <w:szCs w:val="17"/>
         </w:rPr>
-        <w:t xml:space="preserve">        </w:t>
-      </w:r>
-      <w:proofErr w:type="gramStart"/>
-      <w:r>
-        <w:rPr>
-          <w:rFonts w:ascii="Consolas" w:eastAsia="Consolas" w:hAnsi="Consolas" w:cs="Consolas"/>
-          <w:sz w:val="17"/>
-          <w:szCs w:val="17"/>
-        </w:rPr>
-        <w:t>self._</w:t>
-      </w:r>
-      <w:proofErr w:type="gramEnd"/>
-      <w:r>
-        <w:rPr>
-          <w:rFonts w:ascii="Consolas" w:eastAsia="Consolas" w:hAnsi="Consolas" w:cs="Consolas"/>
-          <w:sz w:val="17"/>
-          <w:szCs w:val="17"/>
-        </w:rPr>
-        <w:t>products[name</w:t>
-      </w:r>
-      <w:proofErr w:type="gramStart"/>
-      <w:r>
-        <w:rPr>
-          <w:rFonts w:ascii="Consolas" w:eastAsia="Consolas" w:hAnsi="Consolas" w:cs="Consolas"/>
-          <w:sz w:val="17"/>
-          <w:szCs w:val="17"/>
-        </w:rPr>
-        <w:t>].quantity</w:t>
-      </w:r>
-      <w:proofErr w:type="gramEnd"/>
-      <w:r>
-        <w:rPr>
-          <w:rFonts w:ascii="Consolas" w:eastAsia="Consolas" w:hAnsi="Consolas" w:cs="Consolas"/>
-          <w:sz w:val="17"/>
-          <w:szCs w:val="17"/>
-        </w:rPr>
-        <w:t xml:space="preserve"> = int(quantity)</w:t>
+        <w:t xml:space="preserve">        self._products[name].quantity = int(quantity)</w:t>
       </w:r>
     </w:p>
     <w:p>
@@ -5843,89 +4040,35 @@
           <w:sz w:val="17"/>
           <w:szCs w:val="17"/>
         </w:rPr>
-        <w:t xml:space="preserve">    def remove_</w:t>
-      </w:r>
-      <w:proofErr w:type="gramStart"/>
-      <w:r>
-        <w:rPr>
-          <w:rFonts w:ascii="Consolas" w:eastAsia="Consolas" w:hAnsi="Consolas" w:cs="Consolas"/>
-          <w:sz w:val="17"/>
-          <w:szCs w:val="17"/>
-        </w:rPr>
-        <w:t>product(</w:t>
-      </w:r>
-      <w:proofErr w:type="gramEnd"/>
-      <w:r>
-        <w:rPr>
-          <w:rFonts w:ascii="Consolas" w:eastAsia="Consolas" w:hAnsi="Consolas" w:cs="Consolas"/>
-          <w:sz w:val="17"/>
-          <w:szCs w:val="17"/>
-        </w:rPr>
-        <w:t>self, name):</w:t>
-      </w:r>
-    </w:p>
-    <w:p>
-      <w:pPr>
-        <w:shd w:val="clear" w:color="auto" w:fill="F2F2F2"/>
-        <w:ind w:left="240" w:right="240"/>
-      </w:pPr>
-      <w:r>
-        <w:rPr>
-          <w:rFonts w:ascii="Consolas" w:eastAsia="Consolas" w:hAnsi="Consolas" w:cs="Consolas"/>
-          <w:sz w:val="17"/>
-          <w:szCs w:val="17"/>
-        </w:rPr>
-        <w:t xml:space="preserve">        if name in </w:t>
-      </w:r>
-      <w:proofErr w:type="gramStart"/>
-      <w:r>
-        <w:rPr>
-          <w:rFonts w:ascii="Consolas" w:eastAsia="Consolas" w:hAnsi="Consolas" w:cs="Consolas"/>
-          <w:sz w:val="17"/>
-          <w:szCs w:val="17"/>
-        </w:rPr>
-        <w:t>self._</w:t>
-      </w:r>
-      <w:proofErr w:type="gramEnd"/>
-      <w:r>
-        <w:rPr>
-          <w:rFonts w:ascii="Consolas" w:eastAsia="Consolas" w:hAnsi="Consolas" w:cs="Consolas"/>
-          <w:sz w:val="17"/>
-          <w:szCs w:val="17"/>
-        </w:rPr>
-        <w:t>products:</w:t>
-      </w:r>
-    </w:p>
-    <w:p>
-      <w:pPr>
-        <w:shd w:val="clear" w:color="auto" w:fill="F2F2F2"/>
-        <w:ind w:left="240" w:right="240"/>
-      </w:pPr>
-      <w:r>
-        <w:rPr>
-          <w:rFonts w:ascii="Consolas" w:eastAsia="Consolas" w:hAnsi="Consolas" w:cs="Consolas"/>
-          <w:sz w:val="17"/>
-          <w:szCs w:val="17"/>
-        </w:rPr>
-        <w:t xml:space="preserve">            del </w:t>
-      </w:r>
-      <w:proofErr w:type="gramStart"/>
-      <w:r>
-        <w:rPr>
-          <w:rFonts w:ascii="Consolas" w:eastAsia="Consolas" w:hAnsi="Consolas" w:cs="Consolas"/>
-          <w:sz w:val="17"/>
-          <w:szCs w:val="17"/>
-        </w:rPr>
-        <w:t>self._</w:t>
-      </w:r>
-      <w:proofErr w:type="gramEnd"/>
-      <w:r>
-        <w:rPr>
-          <w:rFonts w:ascii="Consolas" w:eastAsia="Consolas" w:hAnsi="Consolas" w:cs="Consolas"/>
-          <w:sz w:val="17"/>
-          <w:szCs w:val="17"/>
-        </w:rPr>
-        <w:t>products[name]</w:t>
+        <w:t xml:space="preserve">    def remove_product(self, name):</w:t>
+      </w:r>
+    </w:p>
+    <w:p>
+      <w:pPr>
+        <w:shd w:val="clear" w:color="auto" w:fill="F2F2F2"/>
+        <w:ind w:left="240" w:right="240"/>
+      </w:pPr>
+      <w:r>
+        <w:rPr>
+          <w:rFonts w:ascii="Consolas" w:eastAsia="Consolas" w:hAnsi="Consolas" w:cs="Consolas"/>
+          <w:sz w:val="17"/>
+          <w:szCs w:val="17"/>
+        </w:rPr>
+        <w:t xml:space="preserve">        if name in self._products:</w:t>
+      </w:r>
+    </w:p>
+    <w:p>
+      <w:pPr>
+        <w:shd w:val="clear" w:color="auto" w:fill="F2F2F2"/>
+        <w:ind w:left="240" w:right="240"/>
+      </w:pPr>
+      <w:r>
+        <w:rPr>
+          <w:rFonts w:ascii="Consolas" w:eastAsia="Consolas" w:hAnsi="Consolas" w:cs="Consolas"/>
+          <w:sz w:val="17"/>
+          <w:szCs w:val="17"/>
+        </w:rPr>
+        <w:t xml:space="preserve">            del self._products[name]</w:t>
       </w:r>
     </w:p>
     <w:p>
@@ -5981,57 +4124,21 @@
           <w:sz w:val="17"/>
           <w:szCs w:val="17"/>
         </w:rPr>
-        <w:t xml:space="preserve">    def search_</w:t>
-      </w:r>
-      <w:proofErr w:type="gramStart"/>
-      <w:r>
-        <w:rPr>
-          <w:rFonts w:ascii="Consolas" w:eastAsia="Consolas" w:hAnsi="Consolas" w:cs="Consolas"/>
-          <w:sz w:val="17"/>
-          <w:szCs w:val="17"/>
-        </w:rPr>
-        <w:t>product(</w:t>
-      </w:r>
-      <w:proofErr w:type="gramEnd"/>
-      <w:r>
-        <w:rPr>
-          <w:rFonts w:ascii="Consolas" w:eastAsia="Consolas" w:hAnsi="Consolas" w:cs="Consolas"/>
-          <w:sz w:val="17"/>
-          <w:szCs w:val="17"/>
-        </w:rPr>
-        <w:t>self, name):</w:t>
-      </w:r>
-    </w:p>
-    <w:p>
-      <w:pPr>
-        <w:shd w:val="clear" w:color="auto" w:fill="F2F2F2"/>
-        <w:ind w:left="240" w:right="240"/>
-      </w:pPr>
-      <w:r>
-        <w:rPr>
-          <w:rFonts w:ascii="Consolas" w:eastAsia="Consolas" w:hAnsi="Consolas" w:cs="Consolas"/>
-          <w:sz w:val="17"/>
-          <w:szCs w:val="17"/>
-        </w:rPr>
-        <w:t xml:space="preserve">        if name in </w:t>
-      </w:r>
-      <w:proofErr w:type="gramStart"/>
-      <w:r>
-        <w:rPr>
-          <w:rFonts w:ascii="Consolas" w:eastAsia="Consolas" w:hAnsi="Consolas" w:cs="Consolas"/>
-          <w:sz w:val="17"/>
-          <w:szCs w:val="17"/>
-        </w:rPr>
-        <w:t>self._</w:t>
-      </w:r>
-      <w:proofErr w:type="gramEnd"/>
-      <w:r>
-        <w:rPr>
-          <w:rFonts w:ascii="Consolas" w:eastAsia="Consolas" w:hAnsi="Consolas" w:cs="Consolas"/>
-          <w:sz w:val="17"/>
-          <w:szCs w:val="17"/>
-        </w:rPr>
-        <w:t>products:</w:t>
+        <w:t xml:space="preserve">    def search_product(self, name):</w:t>
+      </w:r>
+    </w:p>
+    <w:p>
+      <w:pPr>
+        <w:shd w:val="clear" w:color="auto" w:fill="F2F2F2"/>
+        <w:ind w:left="240" w:right="240"/>
+      </w:pPr>
+      <w:r>
+        <w:rPr>
+          <w:rFonts w:ascii="Consolas" w:eastAsia="Consolas" w:hAnsi="Consolas" w:cs="Consolas"/>
+          <w:sz w:val="17"/>
+          <w:szCs w:val="17"/>
+        </w:rPr>
+        <w:t xml:space="preserve">        if name in self._products:</w:t>
       </w:r>
     </w:p>
     <w:p>
@@ -6235,21 +4342,7 @@
         <w:rPr>
           <w:lang w:val="es-EC"/>
         </w:rPr>
-        <w:t xml:space="preserve">2.3. </w:t>
-      </w:r>
-      <w:proofErr w:type="gramStart"/>
-      <w:r>
-        <w:rPr>
-          <w:lang w:val="es-EC"/>
-        </w:rPr>
-        <w:t>Parte</w:t>
-      </w:r>
-      <w:proofErr w:type="gramEnd"/>
-      <w:r>
-        <w:rPr>
-          <w:lang w:val="es-EC"/>
-        </w:rPr>
-        <w:t xml:space="preserve"> 3: Proceso iterativo</w:t>
+        <w:t>2.3. Parte 3: Proceso iterativo</w:t>
       </w:r>
     </w:p>
     <w:p>
@@ -6364,25 +4457,7 @@
           <w:sz w:val="17"/>
           <w:szCs w:val="17"/>
         </w:rPr>
-        <w:t xml:space="preserve">  features/update_quantity.feature:</w:t>
-      </w:r>
-      <w:proofErr w:type="gramStart"/>
-      <w:r>
-        <w:rPr>
-          <w:rFonts w:ascii="Consolas" w:eastAsia="Consolas" w:hAnsi="Consolas" w:cs="Consolas"/>
-          <w:sz w:val="17"/>
-          <w:szCs w:val="17"/>
-        </w:rPr>
-        <w:t>7  Update</w:t>
-      </w:r>
-      <w:proofErr w:type="gramEnd"/>
-      <w:r>
-        <w:rPr>
-          <w:rFonts w:ascii="Consolas" w:eastAsia="Consolas" w:hAnsi="Consolas" w:cs="Consolas"/>
-          <w:sz w:val="17"/>
-          <w:szCs w:val="17"/>
-        </w:rPr>
-        <w:t xml:space="preserve"> the quantity of a product</w:t>
+        <w:t xml:space="preserve">  features/update_quantity.feature:7  Update the quantity of a product</w:t>
       </w:r>
     </w:p>
     <w:p>
@@ -6563,15 +4638,12 @@
         <w:jc w:val="center"/>
       </w:pPr>
       <w:r>
-        <w:rPr>
-          <w:noProof/>
-        </w:rPr>
         <w:lastRenderedPageBreak/>
         <w:drawing>
-          <wp:inline distT="0" distB="0" distL="0" distR="0" wp14:anchorId="0AD6201D" wp14:editId="539AAA36">
-            <wp:extent cx="5334000" cy="3752850"/>
-            <wp:effectExtent l="0" t="0" r="0" b="0"/>
-            <wp:docPr id="354337481" name="Imagen 354337481"/>
+          <wp:inline distT="0" distB="0" distL="0" distR="0" wp14:anchorId="61C4B881" wp14:editId="21A2D3EA">
+            <wp:extent cx="5731510" cy="4684395"/>
+            <wp:effectExtent l="0" t="0" r="2540" b="1905"/>
+            <wp:docPr id="685613428" name="Imagen 1"/>
             <wp:cNvGraphicFramePr>
               <a:graphicFrameLocks xmlns:a="http://schemas.openxmlformats.org/drawingml/2006/main" noChangeAspect="1"/>
             </wp:cNvGraphicFramePr>
@@ -6579,22 +4651,19 @@
               <a:graphicData uri="http://schemas.openxmlformats.org/drawingml/2006/picture">
                 <pic:pic xmlns:pic="http://schemas.openxmlformats.org/drawingml/2006/picture">
                   <pic:nvPicPr>
-                    <pic:cNvPr id="0" name=""/>
-                    <pic:cNvPicPr>
-                      <a:picLocks noChangeAspect="1" noChangeArrowheads="1"/>
-                    </pic:cNvPicPr>
+                    <pic:cNvPr id="685613428" name=""/>
+                    <pic:cNvPicPr/>
                   </pic:nvPicPr>
                   <pic:blipFill>
                     <a:blip r:embed="rId12"/>
-                    <a:srcRect/>
                     <a:stretch>
                       <a:fillRect/>
                     </a:stretch>
                   </pic:blipFill>
-                  <pic:spPr bwMode="auto">
+                  <pic:spPr>
                     <a:xfrm>
                       <a:off x="0" y="0"/>
-                      <a:ext cx="5334000" cy="3752850"/>
+                      <a:ext cx="5731510" cy="4684395"/>
                     </a:xfrm>
                     <a:prstGeom prst="rect">
                       <a:avLst/>
@@ -6614,10 +4683,10 @@
       </w:pPr>
       <w:r>
         <w:drawing>
-          <wp:inline distT="0" distB="0" distL="0" distR="0" wp14:anchorId="486714F9" wp14:editId="7F064D9F">
-            <wp:extent cx="5841547" cy="2867025"/>
-            <wp:effectExtent l="0" t="0" r="6985" b="0"/>
-            <wp:docPr id="2030020620" name="Imagen 1"/>
+          <wp:inline distT="0" distB="0" distL="0" distR="0" wp14:anchorId="725E0F75" wp14:editId="1CB160DC">
+            <wp:extent cx="5731510" cy="2887345"/>
+            <wp:effectExtent l="0" t="0" r="2540" b="8255"/>
+            <wp:docPr id="1785712674" name="Imagen 1"/>
             <wp:cNvGraphicFramePr>
               <a:graphicFrameLocks xmlns:a="http://schemas.openxmlformats.org/drawingml/2006/main" noChangeAspect="1"/>
             </wp:cNvGraphicFramePr>
@@ -6625,32 +4694,23 @@
               <a:graphicData uri="http://schemas.openxmlformats.org/drawingml/2006/picture">
                 <pic:pic xmlns:pic="http://schemas.openxmlformats.org/drawingml/2006/picture">
                   <pic:nvPicPr>
-                    <pic:cNvPr id="2030020620" name=""/>
+                    <pic:cNvPr id="1785712674" name=""/>
                     <pic:cNvPicPr/>
                   </pic:nvPicPr>
-                  <pic:blipFill rotWithShape="1">
+                  <pic:blipFill>
                     <a:blip r:embed="rId13"/>
-                    <a:srcRect r="1285"/>
                     <a:stretch>
                       <a:fillRect/>
                     </a:stretch>
                   </pic:blipFill>
-                  <pic:spPr bwMode="auto">
+                  <pic:spPr>
                     <a:xfrm>
                       <a:off x="0" y="0"/>
-                      <a:ext cx="5846953" cy="2869678"/>
+                      <a:ext cx="5731510" cy="2887345"/>
                     </a:xfrm>
                     <a:prstGeom prst="rect">
                       <a:avLst/>
                     </a:prstGeom>
-                    <a:ln>
-                      <a:noFill/>
-                    </a:ln>
-                    <a:extLst>
-                      <a:ext uri="{53640926-AAD7-44D8-BBD7-CCE9431645EC}">
-                        <a14:shadowObscured xmlns:a14="http://schemas.microsoft.com/office/drawing/2010/main"/>
-                      </a:ext>
-                    </a:extLst>
                   </pic:spPr>
                 </pic:pic>
               </a:graphicData>

</xml_diff>